<commit_message>
Add final presentation, milestone 3 workflow doc, LightGBM vs XGBoost comparison, and installments aggregation script
</commit_message>
<xml_diff>
--- a/notebooks/project_workflow - Milestone 1.docx
+++ b/notebooks/project_workflow - Milestone 1.docx
@@ -1148,6 +1148,1450 @@
         </w:rPr>
       </w:pPr>
     </w:p>
+    <w:p>
+      <w:pPr>
+        <w:spacing w:before="100" w:beforeAutospacing="1" w:after="100" w:afterAutospacing="1"/>
+        <w:rPr>
+          <w:rFonts w:ascii="Times New Roman" w:eastAsia="Times New Roman" w:hAnsi="Times New Roman" w:cs="Times New Roman"/>
+          <w:sz w:val="24"/>
+          <w:szCs w:val="24"/>
+          <w:lang w:val="en-US"/>
+        </w:rPr>
+      </w:pPr>
+      <w:r>
+        <w:rPr>
+          <w:rFonts w:ascii="Times New Roman" w:eastAsia="Times New Roman" w:hAnsi="Times New Roman" w:cs="Times New Roman"/>
+          <w:b/>
+          <w:bCs/>
+          <w:sz w:val="24"/>
+          <w:szCs w:val="24"/>
+          <w:lang w:val="en-US"/>
+        </w:rPr>
+        <w:lastRenderedPageBreak/>
+        <w:t>Why these two, together, as a baseline pair:</w:t>
+      </w:r>
+    </w:p>
+    <w:p>
+      <w:pPr>
+        <w:spacing w:before="100" w:beforeAutospacing="1" w:after="100" w:afterAutospacing="1"/>
+        <w:rPr>
+          <w:rFonts w:ascii="Times New Roman" w:eastAsia="Times New Roman" w:hAnsi="Times New Roman" w:cs="Times New Roman"/>
+          <w:sz w:val="24"/>
+          <w:szCs w:val="24"/>
+          <w:lang w:val="en-US"/>
+        </w:rPr>
+      </w:pPr>
+      <w:r>
+        <w:rPr>
+          <w:rFonts w:ascii="Times New Roman" w:eastAsia="Times New Roman" w:hAnsi="Times New Roman" w:cs="Times New Roman"/>
+          <w:b/>
+          <w:bCs/>
+          <w:sz w:val="24"/>
+          <w:szCs w:val="24"/>
+          <w:lang w:val="en-US"/>
+        </w:rPr>
+        <w:t>Logistic Regression</w:t>
+      </w:r>
+      <w:r>
+        <w:rPr>
+          <w:rFonts w:ascii="Times New Roman" w:eastAsia="Times New Roman" w:hAnsi="Times New Roman" w:cs="Times New Roman"/>
+          <w:sz w:val="24"/>
+          <w:szCs w:val="24"/>
+          <w:lang w:val="en-US"/>
+        </w:rPr>
+        <w:t xml:space="preserve"> — the simple, interpretable one:</w:t>
+      </w:r>
+    </w:p>
+    <w:p>
+      <w:pPr>
+        <w:numPr>
+          <w:ilvl w:val="0"/>
+          <w:numId w:val="2"/>
+        </w:numPr>
+        <w:spacing w:before="100" w:beforeAutospacing="1" w:after="100" w:afterAutospacing="1"/>
+        <w:rPr>
+          <w:rFonts w:ascii="Times New Roman" w:eastAsia="Times New Roman" w:hAnsi="Times New Roman" w:cs="Times New Roman"/>
+          <w:sz w:val="24"/>
+          <w:szCs w:val="24"/>
+          <w:lang w:val="en-US"/>
+        </w:rPr>
+      </w:pPr>
+      <w:r>
+        <w:rPr>
+          <w:rFonts w:ascii="Times New Roman" w:eastAsia="Times New Roman" w:hAnsi="Times New Roman" w:cs="Times New Roman"/>
+          <w:sz w:val="24"/>
+          <w:szCs w:val="24"/>
+          <w:lang w:val="en-US"/>
+        </w:rPr>
+        <w:t>It's the classic go-to baseline for a yes/no prediction problem (default or not).</w:t>
+      </w:r>
+    </w:p>
+    <w:p>
+      <w:pPr>
+        <w:numPr>
+          <w:ilvl w:val="0"/>
+          <w:numId w:val="2"/>
+        </w:numPr>
+        <w:spacing w:before="100" w:beforeAutospacing="1" w:after="100" w:afterAutospacing="1"/>
+        <w:rPr>
+          <w:rFonts w:ascii="Times New Roman" w:eastAsia="Times New Roman" w:hAnsi="Times New Roman" w:cs="Times New Roman"/>
+          <w:sz w:val="24"/>
+          <w:szCs w:val="24"/>
+          <w:lang w:val="en-US"/>
+        </w:rPr>
+      </w:pPr>
+      <w:r>
+        <w:rPr>
+          <w:rFonts w:ascii="Times New Roman" w:eastAsia="Times New Roman" w:hAnsi="Times New Roman" w:cs="Times New Roman"/>
+          <w:sz w:val="24"/>
+          <w:szCs w:val="24"/>
+          <w:lang w:val="en-US"/>
+        </w:rPr>
+        <w:t>Its coefficients are easy to read and explain — you can literally see "this feature pushes risk up, this one pushes it down," which is valuable when you need to justify a lending decision to stakeholders or regulators.</w:t>
+      </w:r>
+    </w:p>
+    <w:p>
+      <w:pPr>
+        <w:numPr>
+          <w:ilvl w:val="0"/>
+          <w:numId w:val="2"/>
+        </w:numPr>
+        <w:spacing w:before="100" w:beforeAutospacing="1" w:after="100" w:afterAutospacing="1"/>
+        <w:rPr>
+          <w:rFonts w:ascii="Times New Roman" w:eastAsia="Times New Roman" w:hAnsi="Times New Roman" w:cs="Times New Roman"/>
+          <w:sz w:val="24"/>
+          <w:szCs w:val="24"/>
+          <w:lang w:val="en-US"/>
+        </w:rPr>
+      </w:pPr>
+      <w:r>
+        <w:rPr>
+          <w:rFonts w:ascii="Times New Roman" w:eastAsia="Times New Roman" w:hAnsi="Times New Roman" w:cs="Times New Roman"/>
+          <w:sz w:val="24"/>
+          <w:szCs w:val="24"/>
+          <w:lang w:val="en-US"/>
+        </w:rPr>
+        <w:t xml:space="preserve">It sets a </w:t>
+      </w:r>
+      <w:r>
+        <w:rPr>
+          <w:rFonts w:ascii="Times New Roman" w:eastAsia="Times New Roman" w:hAnsi="Times New Roman" w:cs="Times New Roman"/>
+          <w:i/>
+          <w:iCs/>
+          <w:sz w:val="24"/>
+          <w:szCs w:val="24"/>
+          <w:lang w:val="en-US"/>
+        </w:rPr>
+        <w:t>floor</w:t>
+      </w:r>
+      <w:r>
+        <w:rPr>
+          <w:rFonts w:ascii="Times New Roman" w:eastAsia="Times New Roman" w:hAnsi="Times New Roman" w:cs="Times New Roman"/>
+          <w:sz w:val="24"/>
+          <w:szCs w:val="24"/>
+          <w:lang w:val="en-US"/>
+        </w:rPr>
+        <w:t xml:space="preserve"> — a simple, well-understood benchmark that any more complex model needs to beat to justify its extra complexity.</w:t>
+      </w:r>
+    </w:p>
+    <w:p>
+      <w:pPr>
+        <w:numPr>
+          <w:ilvl w:val="0"/>
+          <w:numId w:val="2"/>
+        </w:numPr>
+        <w:spacing w:before="100" w:beforeAutospacing="1" w:after="100" w:afterAutospacing="1"/>
+        <w:rPr>
+          <w:rFonts w:ascii="Times New Roman" w:eastAsia="Times New Roman" w:hAnsi="Times New Roman" w:cs="Times New Roman"/>
+          <w:sz w:val="24"/>
+          <w:szCs w:val="24"/>
+          <w:lang w:val="en-US"/>
+        </w:rPr>
+      </w:pPr>
+      <w:r>
+        <w:rPr>
+          <w:rFonts w:ascii="Times New Roman" w:eastAsia="Times New Roman" w:hAnsi="Times New Roman" w:cs="Times New Roman"/>
+          <w:sz w:val="24"/>
+          <w:szCs w:val="24"/>
+          <w:lang w:val="en-US"/>
+        </w:rPr>
+        <w:t>Downside: it needs extra prep work (filling in missing values, scaling the numbers) and it assumes fairly simple, straight-line relationships between features and risk — real-world credit risk is messier than that.</w:t>
+      </w:r>
+    </w:p>
+    <w:p>
+      <w:pPr>
+        <w:spacing w:before="100" w:beforeAutospacing="1" w:after="100" w:afterAutospacing="1"/>
+        <w:rPr>
+          <w:rFonts w:ascii="Times New Roman" w:eastAsia="Times New Roman" w:hAnsi="Times New Roman" w:cs="Times New Roman"/>
+          <w:sz w:val="24"/>
+          <w:szCs w:val="24"/>
+          <w:lang w:val="en-US"/>
+        </w:rPr>
+      </w:pPr>
+      <w:proofErr w:type="spellStart"/>
+      <w:r>
+        <w:rPr>
+          <w:rFonts w:ascii="Times New Roman" w:eastAsia="Times New Roman" w:hAnsi="Times New Roman" w:cs="Times New Roman"/>
+          <w:b/>
+          <w:bCs/>
+          <w:sz w:val="24"/>
+          <w:szCs w:val="24"/>
+          <w:lang w:val="en-US"/>
+        </w:rPr>
+        <w:t>LightGBM</w:t>
+      </w:r>
+      <w:proofErr w:type="spellEnd"/>
+      <w:r>
+        <w:rPr>
+          <w:rFonts w:ascii="Times New Roman" w:eastAsia="Times New Roman" w:hAnsi="Times New Roman" w:cs="Times New Roman"/>
+          <w:sz w:val="24"/>
+          <w:szCs w:val="24"/>
+          <w:lang w:val="en-US"/>
+        </w:rPr>
+        <w:t xml:space="preserve"> — the more powerful, flexible one:</w:t>
+      </w:r>
+    </w:p>
+    <w:p>
+      <w:pPr>
+        <w:numPr>
+          <w:ilvl w:val="0"/>
+          <w:numId w:val="3"/>
+        </w:numPr>
+        <w:spacing w:before="100" w:beforeAutospacing="1" w:after="100" w:afterAutospacing="1"/>
+        <w:rPr>
+          <w:rFonts w:ascii="Times New Roman" w:eastAsia="Times New Roman" w:hAnsi="Times New Roman" w:cs="Times New Roman"/>
+          <w:sz w:val="24"/>
+          <w:szCs w:val="24"/>
+        </w:rPr>
+      </w:pPr>
+      <w:r>
+        <w:rPr>
+          <w:rFonts w:ascii="Times New Roman" w:eastAsia="Times New Roman" w:hAnsi="Times New Roman" w:cs="Times New Roman"/>
+          <w:sz w:val="24"/>
+          <w:szCs w:val="24"/>
+          <w:lang w:val="en-US"/>
+        </w:rPr>
+        <w:t xml:space="preserve">It's a gradient boosting model (tree-based), which is generally the strongest performer on this </w:t>
+      </w:r>
+      <w:r>
+        <w:rPr>
+          <w:rFonts w:ascii="Times New Roman" w:eastAsia="Times New Roman" w:hAnsi="Times New Roman" w:cs="Times New Roman"/>
+          <w:i/>
+          <w:iCs/>
+          <w:sz w:val="24"/>
+          <w:szCs w:val="24"/>
+          <w:lang w:val="en-US"/>
+        </w:rPr>
+        <w:t>type</w:t>
+      </w:r>
+      <w:r>
+        <w:rPr>
+          <w:rFonts w:ascii="Times New Roman" w:eastAsia="Times New Roman" w:hAnsi="Times New Roman" w:cs="Times New Roman"/>
+          <w:sz w:val="24"/>
+          <w:szCs w:val="24"/>
+          <w:lang w:val="en-US"/>
+        </w:rPr>
+        <w:t xml:space="preserve"> of data: a big spreadsheet-style table with lots of columns, many missing values, and a mix of numeric and categorical features. </w:t>
+      </w:r>
+      <w:r>
+        <w:rPr>
+          <w:rFonts w:ascii="Times New Roman" w:eastAsia="Times New Roman" w:hAnsi="Times New Roman" w:cs="Times New Roman"/>
+          <w:sz w:val="24"/>
+          <w:szCs w:val="24"/>
+        </w:rPr>
+        <w:t>That's exactly what this dataset is.</w:t>
+      </w:r>
+    </w:p>
+    <w:p>
+      <w:pPr>
+        <w:numPr>
+          <w:ilvl w:val="0"/>
+          <w:numId w:val="3"/>
+        </w:numPr>
+        <w:spacing w:before="100" w:beforeAutospacing="1" w:after="100" w:afterAutospacing="1"/>
+        <w:rPr>
+          <w:rFonts w:ascii="Times New Roman" w:eastAsia="Times New Roman" w:hAnsi="Times New Roman" w:cs="Times New Roman"/>
+          <w:sz w:val="24"/>
+          <w:szCs w:val="24"/>
+          <w:lang w:val="en-US"/>
+        </w:rPr>
+      </w:pPr>
+      <w:r>
+        <w:rPr>
+          <w:rFonts w:ascii="Times New Roman" w:eastAsia="Times New Roman" w:hAnsi="Times New Roman" w:cs="Times New Roman"/>
+          <w:sz w:val="24"/>
+          <w:szCs w:val="24"/>
+          <w:lang w:val="en-US"/>
+        </w:rPr>
+        <w:t>It handles missing values on its own — no manual filling-in needed.</w:t>
+      </w:r>
+    </w:p>
+    <w:p>
+      <w:pPr>
+        <w:numPr>
+          <w:ilvl w:val="0"/>
+          <w:numId w:val="3"/>
+        </w:numPr>
+        <w:spacing w:before="100" w:beforeAutospacing="1" w:after="100" w:afterAutospacing="1"/>
+        <w:rPr>
+          <w:rFonts w:ascii="Times New Roman" w:eastAsia="Times New Roman" w:hAnsi="Times New Roman" w:cs="Times New Roman"/>
+          <w:sz w:val="24"/>
+          <w:szCs w:val="24"/>
+          <w:lang w:val="en-US"/>
+        </w:rPr>
+      </w:pPr>
+      <w:r>
+        <w:rPr>
+          <w:rFonts w:ascii="Times New Roman" w:eastAsia="Times New Roman" w:hAnsi="Times New Roman" w:cs="Times New Roman"/>
+          <w:sz w:val="24"/>
+          <w:szCs w:val="24"/>
+          <w:lang w:val="en-US"/>
+        </w:rPr>
+        <w:t>It doesn't care about feature scale, so no need to standardize numbers first.</w:t>
+      </w:r>
+    </w:p>
+    <w:p>
+      <w:pPr>
+        <w:numPr>
+          <w:ilvl w:val="0"/>
+          <w:numId w:val="3"/>
+        </w:numPr>
+        <w:spacing w:before="100" w:beforeAutospacing="1" w:after="100" w:afterAutospacing="1"/>
+        <w:rPr>
+          <w:rFonts w:ascii="Times New Roman" w:eastAsia="Times New Roman" w:hAnsi="Times New Roman" w:cs="Times New Roman"/>
+          <w:sz w:val="24"/>
+          <w:szCs w:val="24"/>
+          <w:lang w:val="en-US"/>
+        </w:rPr>
+      </w:pPr>
+      <w:r>
+        <w:rPr>
+          <w:rFonts w:ascii="Times New Roman" w:eastAsia="Times New Roman" w:hAnsi="Times New Roman" w:cs="Times New Roman"/>
+          <w:sz w:val="24"/>
+          <w:szCs w:val="24"/>
+          <w:lang w:val="en-US"/>
+        </w:rPr>
+        <w:t xml:space="preserve">It can capture more complex, non-straight-line patterns (e.g., "risk goes up with age, but only past a certain </w:t>
+      </w:r>
+      <w:proofErr w:type="gramStart"/>
+      <w:r>
+        <w:rPr>
+          <w:rFonts w:ascii="Times New Roman" w:eastAsia="Times New Roman" w:hAnsi="Times New Roman" w:cs="Times New Roman"/>
+          <w:sz w:val="24"/>
+          <w:szCs w:val="24"/>
+          <w:lang w:val="en-US"/>
+        </w:rPr>
+        <w:t>point,</w:t>
+      </w:r>
+      <w:proofErr w:type="gramEnd"/>
+      <w:r>
+        <w:rPr>
+          <w:rFonts w:ascii="Times New Roman" w:eastAsia="Times New Roman" w:hAnsi="Times New Roman" w:cs="Times New Roman"/>
+          <w:sz w:val="24"/>
+          <w:szCs w:val="24"/>
+          <w:lang w:val="en-US"/>
+        </w:rPr>
+        <w:t xml:space="preserve"> and only if income is also low").</w:t>
+      </w:r>
+    </w:p>
+    <w:p>
+      <w:pPr>
+        <w:spacing w:before="100" w:beforeAutospacing="1" w:after="100" w:afterAutospacing="1"/>
+        <w:rPr>
+          <w:rFonts w:ascii="Times New Roman" w:eastAsia="Times New Roman" w:hAnsi="Times New Roman" w:cs="Times New Roman"/>
+          <w:sz w:val="24"/>
+          <w:szCs w:val="24"/>
+          <w:lang w:val="en-US"/>
+        </w:rPr>
+      </w:pPr>
+      <w:r>
+        <w:rPr>
+          <w:rFonts w:ascii="Times New Roman" w:eastAsia="Times New Roman" w:hAnsi="Times New Roman" w:cs="Times New Roman"/>
+          <w:b/>
+          <w:bCs/>
+          <w:sz w:val="24"/>
+          <w:szCs w:val="24"/>
+          <w:lang w:val="en-US"/>
+        </w:rPr>
+        <w:t>Why compare both instead of just picking one:</w:t>
+      </w:r>
+      <w:r>
+        <w:rPr>
+          <w:rFonts w:ascii="Times New Roman" w:eastAsia="Times New Roman" w:hAnsi="Times New Roman" w:cs="Times New Roman"/>
+          <w:sz w:val="24"/>
+          <w:szCs w:val="24"/>
+          <w:lang w:val="en-US"/>
+        </w:rPr>
+        <w:br/>
+        <w:t xml:space="preserve">This gives you a natural before/after comparison — a simple, transparent model vs. a more powerful one — so you can show </w:t>
+      </w:r>
+      <w:r>
+        <w:rPr>
+          <w:rFonts w:ascii="Times New Roman" w:eastAsia="Times New Roman" w:hAnsi="Times New Roman" w:cs="Times New Roman"/>
+          <w:i/>
+          <w:iCs/>
+          <w:sz w:val="24"/>
+          <w:szCs w:val="24"/>
+          <w:lang w:val="en-US"/>
+        </w:rPr>
+        <w:t>how much</w:t>
+      </w:r>
+      <w:r>
+        <w:rPr>
+          <w:rFonts w:ascii="Times New Roman" w:eastAsia="Times New Roman" w:hAnsi="Times New Roman" w:cs="Times New Roman"/>
+          <w:sz w:val="24"/>
+          <w:szCs w:val="24"/>
+          <w:lang w:val="en-US"/>
+        </w:rPr>
+        <w:t xml:space="preserve"> better the fancier model does (0.7472 → 0.7619 AUC), and make an informed, evidence-based case for using the more complex model going forward, rather than just assuming it's better.</w:t>
+      </w:r>
+    </w:p>
+    <w:p>
+      <w:pPr>
+        <w:pBdr>
+          <w:bottom w:val="single" w:sz="6" w:space="1" w:color="auto"/>
+        </w:pBdr>
+        <w:spacing w:before="100" w:beforeAutospacing="1" w:after="100" w:afterAutospacing="1"/>
+        <w:rPr>
+          <w:rFonts w:ascii="Times New Roman" w:eastAsia="Times New Roman" w:hAnsi="Times New Roman" w:cs="Times New Roman"/>
+          <w:sz w:val="24"/>
+          <w:szCs w:val="24"/>
+          <w:lang w:val="en-US"/>
+        </w:rPr>
+      </w:pPr>
+      <w:r>
+        <w:rPr>
+          <w:rFonts w:ascii="Times New Roman" w:eastAsia="Times New Roman" w:hAnsi="Times New Roman" w:cs="Times New Roman"/>
+          <w:sz w:val="24"/>
+          <w:szCs w:val="24"/>
+          <w:lang w:val="en-US"/>
+        </w:rPr>
+        <w:t xml:space="preserve">In short: Logistic Regression = the honest, simple baseline; </w:t>
+      </w:r>
+      <w:proofErr w:type="spellStart"/>
+      <w:r>
+        <w:rPr>
+          <w:rFonts w:ascii="Times New Roman" w:eastAsia="Times New Roman" w:hAnsi="Times New Roman" w:cs="Times New Roman"/>
+          <w:sz w:val="24"/>
+          <w:szCs w:val="24"/>
+          <w:lang w:val="en-US"/>
+        </w:rPr>
+        <w:t>LightGBM</w:t>
+      </w:r>
+      <w:proofErr w:type="spellEnd"/>
+      <w:r>
+        <w:rPr>
+          <w:rFonts w:ascii="Times New Roman" w:eastAsia="Times New Roman" w:hAnsi="Times New Roman" w:cs="Times New Roman"/>
+          <w:sz w:val="24"/>
+          <w:szCs w:val="24"/>
+          <w:lang w:val="en-US"/>
+        </w:rPr>
+        <w:t xml:space="preserve"> = the realistic, higher-performing option — and comparing them is standard practice before committing to a more complex model.</w:t>
+      </w:r>
+    </w:p>
+    <w:p>
+      <w:pPr>
+        <w:pBdr>
+          <w:bottom w:val="single" w:sz="6" w:space="1" w:color="auto"/>
+        </w:pBdr>
+        <w:spacing w:before="100" w:beforeAutospacing="1" w:after="100" w:afterAutospacing="1"/>
+        <w:rPr>
+          <w:rFonts w:ascii="Times New Roman" w:eastAsia="Times New Roman" w:hAnsi="Times New Roman" w:cs="Times New Roman"/>
+          <w:sz w:val="24"/>
+          <w:szCs w:val="24"/>
+          <w:lang w:val="en-US"/>
+        </w:rPr>
+      </w:pPr>
+    </w:p>
+    <w:p>
+      <w:pPr>
+        <w:pStyle w:val="font-claude-response-body"/>
+        <w:rPr>
+          <w:lang w:val="en-US"/>
+        </w:rPr>
+      </w:pPr>
+    </w:p>
+    <w:p>
+      <w:pPr>
+        <w:pStyle w:val="font-claude-response-body"/>
+        <w:rPr>
+          <w:lang w:val="en-US"/>
+        </w:rPr>
+      </w:pPr>
+    </w:p>
+    <w:p>
+      <w:pPr>
+        <w:pStyle w:val="font-claude-response-body"/>
+        <w:rPr>
+          <w:lang w:val="en-US"/>
+        </w:rPr>
+      </w:pPr>
+    </w:p>
+    <w:p>
+      <w:pPr>
+        <w:pStyle w:val="font-claude-response-body"/>
+        <w:rPr>
+          <w:lang w:val="en-US"/>
+        </w:rPr>
+      </w:pPr>
+    </w:p>
+    <w:p>
+      <w:pPr>
+        <w:pStyle w:val="font-claude-response-body"/>
+        <w:rPr>
+          <w:lang w:val="en-US"/>
+        </w:rPr>
+      </w:pPr>
+    </w:p>
+    <w:p>
+      <w:pPr>
+        <w:pStyle w:val="font-claude-response-body"/>
+        <w:rPr>
+          <w:lang w:val="en-US"/>
+        </w:rPr>
+      </w:pPr>
+    </w:p>
+    <w:p>
+      <w:pPr>
+        <w:pStyle w:val="font-claude-response-body"/>
+        <w:rPr>
+          <w:lang w:val="en-US"/>
+        </w:rPr>
+      </w:pPr>
+    </w:p>
+    <w:p>
+      <w:pPr>
+        <w:pStyle w:val="font-claude-response-body"/>
+        <w:rPr>
+          <w:lang w:val="en-US"/>
+        </w:rPr>
+      </w:pPr>
+      <w:r>
+        <w:rPr>
+          <w:lang w:val="en-US"/>
+        </w:rPr>
+        <w:lastRenderedPageBreak/>
+        <w:t xml:space="preserve">Good question — but I should be upfront: none of your project files (notebooks, deck, or Milestone 3 doc) actually explain </w:t>
+      </w:r>
+      <w:r>
+        <w:rPr>
+          <w:rStyle w:val="Emphasis"/>
+          <w:lang w:val="en-US"/>
+        </w:rPr>
+        <w:t>why</w:t>
+      </w:r>
+      <w:r>
+        <w:rPr>
+          <w:lang w:val="en-US"/>
+        </w:rPr>
+        <w:t xml:space="preserve"> </w:t>
+      </w:r>
+      <w:proofErr w:type="spellStart"/>
+      <w:r>
+        <w:rPr>
+          <w:lang w:val="en-US"/>
+        </w:rPr>
+        <w:t>LightGBM</w:t>
+      </w:r>
+      <w:proofErr w:type="spellEnd"/>
+      <w:r>
+        <w:rPr>
+          <w:lang w:val="en-US"/>
+        </w:rPr>
+        <w:t xml:space="preserve"> was chosen over </w:t>
+      </w:r>
+      <w:proofErr w:type="spellStart"/>
+      <w:r>
+        <w:rPr>
+          <w:lang w:val="en-US"/>
+        </w:rPr>
+        <w:t>XGBoost</w:t>
+      </w:r>
+      <w:proofErr w:type="spellEnd"/>
+      <w:r>
+        <w:rPr>
+          <w:lang w:val="en-US"/>
+        </w:rPr>
+        <w:t xml:space="preserve"> specifically. The notebooks just use </w:t>
+      </w:r>
+      <w:proofErr w:type="spellStart"/>
+      <w:r>
+        <w:rPr>
+          <w:lang w:val="en-US"/>
+        </w:rPr>
+        <w:t>LightGBM</w:t>
+      </w:r>
+      <w:proofErr w:type="spellEnd"/>
+      <w:r>
+        <w:rPr>
+          <w:lang w:val="en-US"/>
+        </w:rPr>
+        <w:t xml:space="preserve"> directly without discussing that decision. So I can't tell you what your specific reasoning was at the time — but I can give you a solid technical comparison so you can explain the choice if asked (e.g., in a presentation or defense).</w:t>
+      </w:r>
+    </w:p>
+    <w:p>
+      <w:pPr>
+        <w:pStyle w:val="Heading3"/>
+        <w:rPr>
+          <w:b/>
+          <w:sz w:val="32"/>
+          <w:szCs w:val="32"/>
+          <w:u w:val="single"/>
+          <w:lang w:val="en-US"/>
+        </w:rPr>
+      </w:pPr>
+      <w:proofErr w:type="spellStart"/>
+      <w:r>
+        <w:rPr>
+          <w:b/>
+          <w:sz w:val="32"/>
+          <w:szCs w:val="32"/>
+          <w:u w:val="single"/>
+          <w:lang w:val="en-US"/>
+        </w:rPr>
+        <w:t>LightGBM</w:t>
+      </w:r>
+      <w:proofErr w:type="spellEnd"/>
+      <w:r>
+        <w:rPr>
+          <w:b/>
+          <w:sz w:val="32"/>
+          <w:szCs w:val="32"/>
+          <w:u w:val="single"/>
+          <w:lang w:val="en-US"/>
+        </w:rPr>
+        <w:t xml:space="preserve"> vs. </w:t>
+      </w:r>
+      <w:proofErr w:type="spellStart"/>
+      <w:r>
+        <w:rPr>
+          <w:b/>
+          <w:sz w:val="32"/>
+          <w:szCs w:val="32"/>
+          <w:u w:val="single"/>
+          <w:lang w:val="en-US"/>
+        </w:rPr>
+        <w:t>XGBoost</w:t>
+      </w:r>
+      <w:proofErr w:type="spellEnd"/>
+      <w:r>
+        <w:rPr>
+          <w:b/>
+          <w:sz w:val="32"/>
+          <w:szCs w:val="32"/>
+          <w:u w:val="single"/>
+          <w:lang w:val="en-US"/>
+        </w:rPr>
+        <w:t xml:space="preserve"> — full comparison</w:t>
+      </w:r>
+    </w:p>
+    <w:p>
+      <w:pPr>
+        <w:pStyle w:val="font-claude-response-body"/>
+        <w:rPr>
+          <w:lang w:val="en-US"/>
+        </w:rPr>
+      </w:pPr>
+      <w:r>
+        <w:rPr>
+          <w:lang w:val="en-US"/>
+        </w:rPr>
+        <w:t xml:space="preserve">Both are </w:t>
+      </w:r>
+      <w:r>
+        <w:rPr>
+          <w:rStyle w:val="Strong"/>
+          <w:lang w:val="en-US"/>
+        </w:rPr>
+        <w:t>gradient boosting</w:t>
+      </w:r>
+      <w:r>
+        <w:rPr>
+          <w:lang w:val="en-US"/>
+        </w:rPr>
+        <w:t xml:space="preserve"> algorithms — they build an ensemble of decision trees one at a time, where each new tree tries to correct the mistakes of the previous ones. They're often neck-and-neck in accuracy on tabular data. The differences are mostly about </w:t>
+      </w:r>
+      <w:r>
+        <w:rPr>
+          <w:rStyle w:val="Emphasis"/>
+          <w:lang w:val="en-US"/>
+        </w:rPr>
+        <w:t>how</w:t>
+      </w:r>
+      <w:r>
+        <w:rPr>
+          <w:lang w:val="en-US"/>
+        </w:rPr>
+        <w:t xml:space="preserve"> they build those trees and </w:t>
+      </w:r>
+      <w:r>
+        <w:rPr>
+          <w:rStyle w:val="Emphasis"/>
+          <w:lang w:val="en-US"/>
+        </w:rPr>
+        <w:t>how fast/efficient</w:t>
+      </w:r>
+      <w:r>
+        <w:rPr>
+          <w:lang w:val="en-US"/>
+        </w:rPr>
+        <w:t xml:space="preserve"> they are.</w:t>
+      </w:r>
+    </w:p>
+    <w:p>
+      <w:pPr>
+        <w:pStyle w:val="Heading4"/>
+        <w:rPr>
+          <w:lang w:val="en-US"/>
+        </w:rPr>
+      </w:pPr>
+      <w:r>
+        <w:rPr>
+          <w:lang w:val="en-US"/>
+        </w:rPr>
+        <w:t>1. Tree-growing strategy (the biggest technical difference)</w:t>
+      </w:r>
+    </w:p>
+    <w:p>
+      <w:pPr>
+        <w:numPr>
+          <w:ilvl w:val="0"/>
+          <w:numId w:val="4"/>
+        </w:numPr>
+        <w:spacing w:before="100" w:beforeAutospacing="1" w:after="100" w:afterAutospacing="1"/>
+        <w:rPr>
+          <w:lang w:val="en-US"/>
+        </w:rPr>
+      </w:pPr>
+      <w:proofErr w:type="spellStart"/>
+      <w:r>
+        <w:rPr>
+          <w:rStyle w:val="Strong"/>
+          <w:lang w:val="en-US"/>
+        </w:rPr>
+        <w:t>XGBoost</w:t>
+      </w:r>
+      <w:proofErr w:type="spellEnd"/>
+      <w:r>
+        <w:rPr>
+          <w:lang w:val="en-US"/>
+        </w:rPr>
+        <w:t xml:space="preserve"> grows trees </w:t>
+      </w:r>
+      <w:r>
+        <w:rPr>
+          <w:rStyle w:val="Strong"/>
+          <w:lang w:val="en-US"/>
+        </w:rPr>
+        <w:t>level-by-level</w:t>
+      </w:r>
+      <w:r>
+        <w:rPr>
+          <w:lang w:val="en-US"/>
+        </w:rPr>
+        <w:t xml:space="preserve"> (depth-wise) — it fills out every branch at one depth before moving to the next.</w:t>
+      </w:r>
+    </w:p>
+    <w:p>
+      <w:pPr>
+        <w:numPr>
+          <w:ilvl w:val="0"/>
+          <w:numId w:val="4"/>
+        </w:numPr>
+        <w:spacing w:before="100" w:beforeAutospacing="1" w:after="100" w:afterAutospacing="1"/>
+        <w:rPr>
+          <w:lang w:val="en-US"/>
+        </w:rPr>
+      </w:pPr>
+      <w:proofErr w:type="spellStart"/>
+      <w:r>
+        <w:rPr>
+          <w:rStyle w:val="Strong"/>
+          <w:lang w:val="en-US"/>
+        </w:rPr>
+        <w:t>LightGBM</w:t>
+      </w:r>
+      <w:proofErr w:type="spellEnd"/>
+      <w:r>
+        <w:rPr>
+          <w:lang w:val="en-US"/>
+        </w:rPr>
+        <w:t xml:space="preserve"> grows trees </w:t>
+      </w:r>
+      <w:r>
+        <w:rPr>
+          <w:rStyle w:val="Strong"/>
+          <w:lang w:val="en-US"/>
+        </w:rPr>
+        <w:t>leaf-by-leaf</w:t>
+      </w:r>
+      <w:r>
+        <w:rPr>
+          <w:lang w:val="en-US"/>
+        </w:rPr>
+        <w:t xml:space="preserve"> (best-first) — it always splits whichever leaf will reduce error the most, regardless of depth.</w:t>
+      </w:r>
+    </w:p>
+    <w:p>
+      <w:pPr>
+        <w:numPr>
+          <w:ilvl w:val="0"/>
+          <w:numId w:val="4"/>
+        </w:numPr>
+        <w:spacing w:before="100" w:beforeAutospacing="1" w:after="100" w:afterAutospacing="1"/>
+        <w:rPr>
+          <w:lang w:val="en-US"/>
+        </w:rPr>
+      </w:pPr>
+      <w:r>
+        <w:rPr>
+          <w:rStyle w:val="Strong"/>
+          <w:lang w:val="en-US"/>
+        </w:rPr>
+        <w:t>Effect:</w:t>
+      </w:r>
+      <w:r>
+        <w:rPr>
+          <w:lang w:val="en-US"/>
+        </w:rPr>
+        <w:t xml:space="preserve"> </w:t>
+      </w:r>
+      <w:proofErr w:type="spellStart"/>
+      <w:r>
+        <w:rPr>
+          <w:lang w:val="en-US"/>
+        </w:rPr>
+        <w:t>LightGBM's</w:t>
+      </w:r>
+      <w:proofErr w:type="spellEnd"/>
+      <w:r>
+        <w:rPr>
+          <w:lang w:val="en-US"/>
+        </w:rPr>
+        <w:t xml:space="preserve"> approach is often more efficient and can reach better accuracy with fewer trees, but it's also more prone to </w:t>
+      </w:r>
+      <w:proofErr w:type="spellStart"/>
+      <w:r>
+        <w:rPr>
+          <w:lang w:val="en-US"/>
+        </w:rPr>
+        <w:t>overfitting</w:t>
+      </w:r>
+      <w:proofErr w:type="spellEnd"/>
+      <w:r>
+        <w:rPr>
+          <w:lang w:val="en-US"/>
+        </w:rPr>
+        <w:t xml:space="preserve"> on smaller datasets since it can build deep, unbalanced trees.</w:t>
+      </w:r>
+    </w:p>
+    <w:p>
+      <w:pPr>
+        <w:pStyle w:val="Heading4"/>
+      </w:pPr>
+      <w:r>
+        <w:t>2. Speed and memory</w:t>
+      </w:r>
+    </w:p>
+    <w:p>
+      <w:pPr>
+        <w:numPr>
+          <w:ilvl w:val="0"/>
+          <w:numId w:val="5"/>
+        </w:numPr>
+        <w:spacing w:before="100" w:beforeAutospacing="1" w:after="100" w:afterAutospacing="1"/>
+        <w:rPr>
+          <w:lang w:val="en-US"/>
+        </w:rPr>
+      </w:pPr>
+      <w:proofErr w:type="spellStart"/>
+      <w:r>
+        <w:rPr>
+          <w:rStyle w:val="Strong"/>
+          <w:lang w:val="en-US"/>
+        </w:rPr>
+        <w:t>LightGBM</w:t>
+      </w:r>
+      <w:proofErr w:type="spellEnd"/>
+      <w:r>
+        <w:rPr>
+          <w:rStyle w:val="Strong"/>
+          <w:lang w:val="en-US"/>
+        </w:rPr>
+        <w:t xml:space="preserve"> is generally faster and more memory-efficient</w:t>
+      </w:r>
+      <w:r>
+        <w:rPr>
+          <w:lang w:val="en-US"/>
+        </w:rPr>
+        <w:t xml:space="preserve">, especially on large datasets — this project has ~307K rows and 96+ features after feature engineering, which is exactly the size where </w:t>
+      </w:r>
+      <w:proofErr w:type="spellStart"/>
+      <w:r>
+        <w:rPr>
+          <w:lang w:val="en-US"/>
+        </w:rPr>
+        <w:t>LightGBM's</w:t>
+      </w:r>
+      <w:proofErr w:type="spellEnd"/>
+      <w:r>
+        <w:rPr>
+          <w:lang w:val="en-US"/>
+        </w:rPr>
+        <w:t xml:space="preserve"> speed advantage becomes noticeable.</w:t>
+      </w:r>
+    </w:p>
+    <w:p>
+      <w:pPr>
+        <w:numPr>
+          <w:ilvl w:val="0"/>
+          <w:numId w:val="5"/>
+        </w:numPr>
+        <w:spacing w:before="100" w:beforeAutospacing="1" w:after="100" w:afterAutospacing="1"/>
+        <w:rPr>
+          <w:lang w:val="en-US"/>
+        </w:rPr>
+      </w:pPr>
+      <w:proofErr w:type="spellStart"/>
+      <w:r>
+        <w:rPr>
+          <w:lang w:val="en-US"/>
+        </w:rPr>
+        <w:t>LightGBM</w:t>
+      </w:r>
+      <w:proofErr w:type="spellEnd"/>
+      <w:r>
+        <w:rPr>
+          <w:lang w:val="en-US"/>
+        </w:rPr>
+        <w:t xml:space="preserve"> uses a technique called </w:t>
+      </w:r>
+      <w:r>
+        <w:rPr>
+          <w:rStyle w:val="Strong"/>
+          <w:lang w:val="en-US"/>
+        </w:rPr>
+        <w:t>histogram-based binning</w:t>
+      </w:r>
+      <w:r>
+        <w:rPr>
+          <w:lang w:val="en-US"/>
+        </w:rPr>
+        <w:t xml:space="preserve"> (grouping continuous values into buckets before splitting), which speeds up training a lot. </w:t>
+      </w:r>
+      <w:proofErr w:type="spellStart"/>
+      <w:r>
+        <w:rPr>
+          <w:lang w:val="en-US"/>
+        </w:rPr>
+        <w:t>XGBoost</w:t>
+      </w:r>
+      <w:proofErr w:type="spellEnd"/>
+      <w:r>
+        <w:rPr>
+          <w:lang w:val="en-US"/>
+        </w:rPr>
+        <w:t xml:space="preserve"> also has a histogram mode now, but </w:t>
+      </w:r>
+      <w:proofErr w:type="spellStart"/>
+      <w:r>
+        <w:rPr>
+          <w:lang w:val="en-US"/>
+        </w:rPr>
+        <w:t>LightGBM</w:t>
+      </w:r>
+      <w:proofErr w:type="spellEnd"/>
+      <w:r>
+        <w:rPr>
+          <w:lang w:val="en-US"/>
+        </w:rPr>
+        <w:t xml:space="preserve"> pioneered it and is typically still faster.</w:t>
+      </w:r>
+    </w:p>
+    <w:p>
+      <w:pPr>
+        <w:pStyle w:val="Heading4"/>
+      </w:pPr>
+      <w:r>
+        <w:t>3. Handling missing values</w:t>
+      </w:r>
+    </w:p>
+    <w:p>
+      <w:pPr>
+        <w:numPr>
+          <w:ilvl w:val="0"/>
+          <w:numId w:val="6"/>
+        </w:numPr>
+        <w:spacing w:before="100" w:beforeAutospacing="1" w:after="100" w:afterAutospacing="1"/>
+        <w:rPr>
+          <w:lang w:val="en-US"/>
+        </w:rPr>
+      </w:pPr>
+      <w:r>
+        <w:rPr>
+          <w:lang w:val="en-US"/>
+        </w:rPr>
+        <w:t xml:space="preserve">Both handle missing values natively (no manual imputation needed) — this matches what you saw in your Milestone 1 notebook, where </w:t>
+      </w:r>
+      <w:proofErr w:type="spellStart"/>
+      <w:r>
+        <w:rPr>
+          <w:lang w:val="en-US"/>
+        </w:rPr>
+        <w:t>LightGBM</w:t>
+      </w:r>
+      <w:proofErr w:type="spellEnd"/>
+      <w:r>
+        <w:rPr>
+          <w:lang w:val="en-US"/>
+        </w:rPr>
+        <w:t xml:space="preserve"> needed no filling-in, unlike Logistic Regression.</w:t>
+      </w:r>
+    </w:p>
+    <w:p>
+      <w:pPr>
+        <w:numPr>
+          <w:ilvl w:val="0"/>
+          <w:numId w:val="6"/>
+        </w:numPr>
+        <w:spacing w:before="100" w:beforeAutospacing="1" w:after="100" w:afterAutospacing="1"/>
+        <w:rPr>
+          <w:lang w:val="en-US"/>
+        </w:rPr>
+      </w:pPr>
+      <w:proofErr w:type="spellStart"/>
+      <w:r>
+        <w:rPr>
+          <w:lang w:val="en-US"/>
+        </w:rPr>
+        <w:t>XGBoost</w:t>
+      </w:r>
+      <w:proofErr w:type="spellEnd"/>
+      <w:r>
+        <w:rPr>
+          <w:lang w:val="en-US"/>
+        </w:rPr>
+        <w:t xml:space="preserve"> does this too, so this isn't a differentiator between the two — just between tree-based models and linear ones.</w:t>
+      </w:r>
+    </w:p>
+    <w:p>
+      <w:pPr>
+        <w:pStyle w:val="Heading4"/>
+      </w:pPr>
+      <w:r>
+        <w:t>4. Handling categorical features</w:t>
+      </w:r>
+    </w:p>
+    <w:p>
+      <w:pPr>
+        <w:numPr>
+          <w:ilvl w:val="0"/>
+          <w:numId w:val="7"/>
+        </w:numPr>
+        <w:spacing w:before="100" w:beforeAutospacing="1" w:after="100" w:afterAutospacing="1"/>
+        <w:rPr>
+          <w:lang w:val="en-US"/>
+        </w:rPr>
+      </w:pPr>
+      <w:proofErr w:type="spellStart"/>
+      <w:r>
+        <w:rPr>
+          <w:rStyle w:val="Strong"/>
+          <w:lang w:val="en-US"/>
+        </w:rPr>
+        <w:t>LightGBM</w:t>
+      </w:r>
+      <w:proofErr w:type="spellEnd"/>
+      <w:r>
+        <w:rPr>
+          <w:rStyle w:val="Strong"/>
+          <w:lang w:val="en-US"/>
+        </w:rPr>
+        <w:t xml:space="preserve"> has native categorical feature support</w:t>
+      </w:r>
+      <w:r>
+        <w:rPr>
+          <w:lang w:val="en-US"/>
+        </w:rPr>
+        <w:t xml:space="preserve"> — you can tell it "this column is categorical" and it splits on categories directly, without needing to convert them to numbers first.</w:t>
+      </w:r>
+    </w:p>
+    <w:p>
+      <w:pPr>
+        <w:numPr>
+          <w:ilvl w:val="0"/>
+          <w:numId w:val="7"/>
+        </w:numPr>
+        <w:spacing w:before="100" w:beforeAutospacing="1" w:after="100" w:afterAutospacing="1"/>
+        <w:rPr>
+          <w:lang w:val="en-US"/>
+        </w:rPr>
+      </w:pPr>
+      <w:proofErr w:type="spellStart"/>
+      <w:r>
+        <w:rPr>
+          <w:rStyle w:val="Strong"/>
+          <w:lang w:val="en-US"/>
+        </w:rPr>
+        <w:t>XGBoost</w:t>
+      </w:r>
+      <w:proofErr w:type="spellEnd"/>
+      <w:r>
+        <w:rPr>
+          <w:lang w:val="en-US"/>
+        </w:rPr>
+        <w:t xml:space="preserve"> (in most standard use) expects numbers, so categorical columns typically need encoding first (which is what your notebook did with </w:t>
+      </w:r>
+      <w:proofErr w:type="spellStart"/>
+      <w:r>
+        <w:rPr>
+          <w:rStyle w:val="HTMLCode"/>
+          <w:rFonts w:eastAsia="Calibri"/>
+          <w:lang w:val="en-US"/>
+        </w:rPr>
+        <w:t>LabelEncoder</w:t>
+      </w:r>
+      <w:proofErr w:type="spellEnd"/>
+      <w:r>
+        <w:rPr>
+          <w:lang w:val="en-US"/>
+        </w:rPr>
+        <w:t xml:space="preserve">, since it's a shared preprocessing step used for both </w:t>
+      </w:r>
+      <w:proofErr w:type="spellStart"/>
+      <w:r>
+        <w:rPr>
+          <w:lang w:val="en-US"/>
+        </w:rPr>
+        <w:t>LogReg</w:t>
+      </w:r>
+      <w:proofErr w:type="spellEnd"/>
+      <w:r>
+        <w:rPr>
+          <w:lang w:val="en-US"/>
+        </w:rPr>
+        <w:t xml:space="preserve"> and the boosting model).</w:t>
+      </w:r>
+    </w:p>
+    <w:p>
+      <w:pPr>
+        <w:pStyle w:val="Heading4"/>
+      </w:pPr>
+      <w:r>
+        <w:t>5. Accuracy</w:t>
+      </w:r>
+    </w:p>
+    <w:p>
+      <w:pPr>
+        <w:numPr>
+          <w:ilvl w:val="0"/>
+          <w:numId w:val="8"/>
+        </w:numPr>
+        <w:spacing w:before="100" w:beforeAutospacing="1" w:after="100" w:afterAutospacing="1"/>
+        <w:rPr>
+          <w:lang w:val="en-US"/>
+        </w:rPr>
+      </w:pPr>
+      <w:r>
+        <w:rPr>
+          <w:lang w:val="en-US"/>
+        </w:rPr>
+        <w:t xml:space="preserve">On most tabular datasets, </w:t>
+      </w:r>
+      <w:r>
+        <w:rPr>
+          <w:rStyle w:val="Strong"/>
+          <w:lang w:val="en-US"/>
+        </w:rPr>
+        <w:t>the two are very close</w:t>
+      </w:r>
+      <w:r>
+        <w:rPr>
+          <w:lang w:val="en-US"/>
+        </w:rPr>
+        <w:t xml:space="preserve"> — neither is a clear universal winner. Small differences usually come down to </w:t>
+      </w:r>
+      <w:proofErr w:type="spellStart"/>
+      <w:r>
+        <w:rPr>
+          <w:lang w:val="en-US"/>
+        </w:rPr>
+        <w:t>hyperparameter</w:t>
+      </w:r>
+      <w:proofErr w:type="spellEnd"/>
+      <w:r>
+        <w:rPr>
+          <w:lang w:val="en-US"/>
+        </w:rPr>
+        <w:t xml:space="preserve"> tuning, not the algorithm itself.</w:t>
+      </w:r>
+    </w:p>
+    <w:p>
+      <w:pPr>
+        <w:numPr>
+          <w:ilvl w:val="0"/>
+          <w:numId w:val="8"/>
+        </w:numPr>
+        <w:spacing w:before="100" w:beforeAutospacing="1" w:after="100" w:afterAutospacing="1"/>
+        <w:rPr>
+          <w:lang w:val="en-US"/>
+        </w:rPr>
+      </w:pPr>
+      <w:proofErr w:type="spellStart"/>
+      <w:r>
+        <w:rPr>
+          <w:lang w:val="en-US"/>
+        </w:rPr>
+        <w:t>Kaggle</w:t>
+      </w:r>
+      <w:proofErr w:type="spellEnd"/>
+      <w:r>
+        <w:rPr>
+          <w:lang w:val="en-US"/>
+        </w:rPr>
+        <w:t xml:space="preserve"> competitions (this dataset is literally from a </w:t>
+      </w:r>
+      <w:proofErr w:type="spellStart"/>
+      <w:r>
+        <w:rPr>
+          <w:lang w:val="en-US"/>
+        </w:rPr>
+        <w:t>Kaggle</w:t>
+      </w:r>
+      <w:proofErr w:type="spellEnd"/>
+      <w:r>
+        <w:rPr>
+          <w:lang w:val="en-US"/>
+        </w:rPr>
+        <w:t xml:space="preserve"> competition) have had winning solutions with both — often winning solutions blend or stack the two together.</w:t>
+      </w:r>
+    </w:p>
+    <w:p>
+      <w:pPr>
+        <w:pStyle w:val="Heading4"/>
+      </w:pPr>
+      <w:r>
+        <w:lastRenderedPageBreak/>
+        <w:t>6. Community default / ecosystem reasons</w:t>
+      </w:r>
+    </w:p>
+    <w:p>
+      <w:pPr>
+        <w:numPr>
+          <w:ilvl w:val="0"/>
+          <w:numId w:val="9"/>
+        </w:numPr>
+        <w:spacing w:before="100" w:beforeAutospacing="1" w:after="100" w:afterAutospacing="1"/>
+        <w:rPr>
+          <w:lang w:val="en-US"/>
+        </w:rPr>
+      </w:pPr>
+      <w:proofErr w:type="spellStart"/>
+      <w:r>
+        <w:rPr>
+          <w:lang w:val="en-US"/>
+        </w:rPr>
+        <w:t>LightGBM</w:t>
+      </w:r>
+      <w:proofErr w:type="spellEnd"/>
+      <w:r>
+        <w:rPr>
+          <w:lang w:val="en-US"/>
+        </w:rPr>
+        <w:t xml:space="preserve"> is popular for large-scale tabular problems specifically because of its speed.</w:t>
+      </w:r>
+    </w:p>
+    <w:p>
+      <w:pPr>
+        <w:numPr>
+          <w:ilvl w:val="0"/>
+          <w:numId w:val="9"/>
+        </w:numPr>
+        <w:spacing w:before="100" w:beforeAutospacing="1" w:after="100" w:afterAutospacing="1"/>
+        <w:rPr>
+          <w:lang w:val="en-US"/>
+        </w:rPr>
+      </w:pPr>
+      <w:proofErr w:type="spellStart"/>
+      <w:r>
+        <w:rPr>
+          <w:lang w:val="en-US"/>
+        </w:rPr>
+        <w:t>XGBoost</w:t>
+      </w:r>
+      <w:proofErr w:type="spellEnd"/>
+      <w:r>
+        <w:rPr>
+          <w:lang w:val="en-US"/>
+        </w:rPr>
+        <w:t xml:space="preserve"> has a longer track record and slightly more tooling/documentation maturity in some ecosystems.</w:t>
+      </w:r>
+    </w:p>
+    <w:p>
+      <w:pPr>
+        <w:pStyle w:val="Heading3"/>
+        <w:rPr>
+          <w:lang w:val="en-US"/>
+        </w:rPr>
+      </w:pPr>
+      <w:r>
+        <w:rPr>
+          <w:lang w:val="en-US"/>
+        </w:rPr>
+        <w:t>Bottom line, in plain terms</w:t>
+      </w:r>
+    </w:p>
+    <w:p>
+      <w:pPr>
+        <w:pStyle w:val="font-claude-response-body"/>
+        <w:rPr>
+          <w:lang w:val="en-US"/>
+        </w:rPr>
+      </w:pPr>
+      <w:r>
+        <w:rPr>
+          <w:lang w:val="en-US"/>
+        </w:rPr>
+        <w:t xml:space="preserve">Neither one is "more correct" — they're two flavors of the same core idea (boosted trees). </w:t>
+      </w:r>
+      <w:proofErr w:type="spellStart"/>
+      <w:r>
+        <w:rPr>
+          <w:rStyle w:val="Strong"/>
+          <w:lang w:val="en-US"/>
+        </w:rPr>
+        <w:t>LightGBM</w:t>
+      </w:r>
+      <w:proofErr w:type="spellEnd"/>
+      <w:r>
+        <w:rPr>
+          <w:rStyle w:val="Strong"/>
+          <w:lang w:val="en-US"/>
+        </w:rPr>
+        <w:t xml:space="preserve"> tends to be the practical pick when speed and memory matter on large datasets with many features</w:t>
+      </w:r>
+      <w:r>
+        <w:rPr>
+          <w:lang w:val="en-US"/>
+        </w:rPr>
+        <w:t xml:space="preserve">, which fits this project's size. If you want to strengthen your project's story, you could genuinely say: </w:t>
+      </w:r>
+      <w:r>
+        <w:rPr>
+          <w:rStyle w:val="Emphasis"/>
+          <w:lang w:val="en-US"/>
+        </w:rPr>
+        <w:t xml:space="preserve">"We used </w:t>
+      </w:r>
+      <w:proofErr w:type="spellStart"/>
+      <w:r>
+        <w:rPr>
+          <w:rStyle w:val="Emphasis"/>
+          <w:lang w:val="en-US"/>
+        </w:rPr>
+        <w:t>LightGBM</w:t>
+      </w:r>
+      <w:proofErr w:type="spellEnd"/>
+      <w:r>
+        <w:rPr>
+          <w:rStyle w:val="Emphasis"/>
+          <w:lang w:val="en-US"/>
+        </w:rPr>
+        <w:t xml:space="preserve"> for its speed and native handling of missing/categorical data on this large dataset; </w:t>
+      </w:r>
+      <w:proofErr w:type="spellStart"/>
+      <w:r>
+        <w:rPr>
+          <w:rStyle w:val="Emphasis"/>
+          <w:lang w:val="en-US"/>
+        </w:rPr>
+        <w:t>XGBoost</w:t>
+      </w:r>
+      <w:proofErr w:type="spellEnd"/>
+      <w:r>
+        <w:rPr>
+          <w:rStyle w:val="Emphasis"/>
+          <w:lang w:val="en-US"/>
+        </w:rPr>
+        <w:t xml:space="preserve"> would likely perform similarly and could be a good next experiment to compare."</w:t>
+      </w:r>
+    </w:p>
+    <w:p>
+      <w:pPr>
+        <w:pStyle w:val="font-claude-response-body"/>
+        <w:rPr>
+          <w:lang w:val="en-US"/>
+        </w:rPr>
+      </w:pPr>
+      <w:r>
+        <w:rPr>
+          <w:lang w:val="en-US"/>
+        </w:rPr>
+        <w:t xml:space="preserve">If you want, I can help you actually run an </w:t>
+      </w:r>
+      <w:proofErr w:type="spellStart"/>
+      <w:r>
+        <w:rPr>
+          <w:lang w:val="en-US"/>
+        </w:rPr>
+        <w:t>XGBoost</w:t>
+      </w:r>
+      <w:proofErr w:type="spellEnd"/>
+      <w:r>
+        <w:rPr>
+          <w:lang w:val="en-US"/>
+        </w:rPr>
+        <w:t xml:space="preserve"> comparison against your existing </w:t>
+      </w:r>
+      <w:proofErr w:type="spellStart"/>
+      <w:r>
+        <w:rPr>
+          <w:lang w:val="en-US"/>
+        </w:rPr>
+        <w:t>LightGBM</w:t>
+      </w:r>
+      <w:proofErr w:type="spellEnd"/>
+      <w:r>
+        <w:rPr>
+          <w:lang w:val="en-US"/>
+        </w:rPr>
+        <w:t xml:space="preserve"> results, using the same train/</w:t>
+      </w:r>
+      <w:proofErr w:type="spellStart"/>
+      <w:r>
+        <w:rPr>
+          <w:lang w:val="en-US"/>
+        </w:rPr>
+        <w:t>val</w:t>
+      </w:r>
+      <w:proofErr w:type="spellEnd"/>
+      <w:r>
+        <w:rPr>
+          <w:lang w:val="en-US"/>
+        </w:rPr>
+        <w:t xml:space="preserve"> split, so you'd have real numbers instead of just a theoretical comparison.</w:t>
+      </w:r>
+    </w:p>
+    <w:p>
+      <w:pPr>
+        <w:pStyle w:val="Heading1"/>
+        <w:spacing w:before="400" w:after="200"/>
+        <w:rPr>
+          <w:color w:val="142438"/>
+          <w:lang w:val="en-US"/>
+        </w:rPr>
+      </w:pPr>
+    </w:p>
+    <w:p>
+      <w:pPr>
+        <w:pStyle w:val="Heading1"/>
+        <w:spacing w:before="400" w:after="200"/>
+        <w:rPr>
+          <w:color w:val="142438"/>
+          <w:lang w:val="en-US"/>
+        </w:rPr>
+      </w:pPr>
+    </w:p>
     <w:sectPr>
       <w:pgSz w:w="12240" w:h="15840"/>
       <w:pgMar w:top="1000" w:right="1200" w:bottom="1000" w:left="1200" w:header="708" w:footer="708" w:gutter="0"/>
@@ -1161,6 +2605,751 @@
 <file path=word/numbering.xml><?xml version="1.0" encoding="utf-8"?>
 <w:numbering xmlns:ve="http://schemas.openxmlformats.org/markup-compatibility/2006" xmlns:o="urn:schemas-microsoft-com:office:office" xmlns:r="http://schemas.openxmlformats.org/officeDocument/2006/relationships" xmlns:m="http://schemas.openxmlformats.org/officeDocument/2006/math" xmlns:v="urn:schemas-microsoft-com:vml" xmlns:wp="http://schemas.openxmlformats.org/drawingml/2006/wordprocessingDrawing" xmlns:w10="urn:schemas-microsoft-com:office:word" xmlns:w="http://schemas.openxmlformats.org/wordprocessingml/2006/main" xmlns:wne="http://schemas.microsoft.com/office/word/2006/wordml">
   <w:abstractNum w:abstractNumId="0">
+    <w:nsid w:val="0BDE7912"/>
+    <w:multiLevelType w:val="multilevel"/>
+    <w:tmpl w:val="E0E67F34"/>
+    <w:lvl w:ilvl="0">
+      <w:start w:val="1"/>
+      <w:numFmt w:val="bullet"/>
+      <w:lvlText w:val=""/>
+      <w:lvlJc w:val="left"/>
+      <w:pPr>
+        <w:tabs>
+          <w:tab w:val="num" w:pos="720"/>
+        </w:tabs>
+        <w:ind w:left="720" w:hanging="360"/>
+      </w:pPr>
+      <w:rPr>
+        <w:rFonts w:ascii="Symbol" w:hAnsi="Symbol" w:hint="default"/>
+        <w:sz w:val="20"/>
+      </w:rPr>
+    </w:lvl>
+    <w:lvl w:ilvl="1" w:tentative="1">
+      <w:start w:val="1"/>
+      <w:numFmt w:val="bullet"/>
+      <w:lvlText w:val="o"/>
+      <w:lvlJc w:val="left"/>
+      <w:pPr>
+        <w:tabs>
+          <w:tab w:val="num" w:pos="1440"/>
+        </w:tabs>
+        <w:ind w:left="1440" w:hanging="360"/>
+      </w:pPr>
+      <w:rPr>
+        <w:rFonts w:ascii="Courier New" w:hAnsi="Courier New" w:hint="default"/>
+        <w:sz w:val="20"/>
+      </w:rPr>
+    </w:lvl>
+    <w:lvl w:ilvl="2" w:tentative="1">
+      <w:start w:val="1"/>
+      <w:numFmt w:val="bullet"/>
+      <w:lvlText w:val=""/>
+      <w:lvlJc w:val="left"/>
+      <w:pPr>
+        <w:tabs>
+          <w:tab w:val="num" w:pos="2160"/>
+        </w:tabs>
+        <w:ind w:left="2160" w:hanging="360"/>
+      </w:pPr>
+      <w:rPr>
+        <w:rFonts w:ascii="Wingdings" w:hAnsi="Wingdings" w:hint="default"/>
+        <w:sz w:val="20"/>
+      </w:rPr>
+    </w:lvl>
+    <w:lvl w:ilvl="3" w:tentative="1">
+      <w:start w:val="1"/>
+      <w:numFmt w:val="bullet"/>
+      <w:lvlText w:val=""/>
+      <w:lvlJc w:val="left"/>
+      <w:pPr>
+        <w:tabs>
+          <w:tab w:val="num" w:pos="2880"/>
+        </w:tabs>
+        <w:ind w:left="2880" w:hanging="360"/>
+      </w:pPr>
+      <w:rPr>
+        <w:rFonts w:ascii="Wingdings" w:hAnsi="Wingdings" w:hint="default"/>
+        <w:sz w:val="20"/>
+      </w:rPr>
+    </w:lvl>
+    <w:lvl w:ilvl="4" w:tentative="1">
+      <w:start w:val="1"/>
+      <w:numFmt w:val="bullet"/>
+      <w:lvlText w:val=""/>
+      <w:lvlJc w:val="left"/>
+      <w:pPr>
+        <w:tabs>
+          <w:tab w:val="num" w:pos="3600"/>
+        </w:tabs>
+        <w:ind w:left="3600" w:hanging="360"/>
+      </w:pPr>
+      <w:rPr>
+        <w:rFonts w:ascii="Wingdings" w:hAnsi="Wingdings" w:hint="default"/>
+        <w:sz w:val="20"/>
+      </w:rPr>
+    </w:lvl>
+    <w:lvl w:ilvl="5" w:tentative="1">
+      <w:start w:val="1"/>
+      <w:numFmt w:val="bullet"/>
+      <w:lvlText w:val=""/>
+      <w:lvlJc w:val="left"/>
+      <w:pPr>
+        <w:tabs>
+          <w:tab w:val="num" w:pos="4320"/>
+        </w:tabs>
+        <w:ind w:left="4320" w:hanging="360"/>
+      </w:pPr>
+      <w:rPr>
+        <w:rFonts w:ascii="Wingdings" w:hAnsi="Wingdings" w:hint="default"/>
+        <w:sz w:val="20"/>
+      </w:rPr>
+    </w:lvl>
+    <w:lvl w:ilvl="6" w:tentative="1">
+      <w:start w:val="1"/>
+      <w:numFmt w:val="bullet"/>
+      <w:lvlText w:val=""/>
+      <w:lvlJc w:val="left"/>
+      <w:pPr>
+        <w:tabs>
+          <w:tab w:val="num" w:pos="5040"/>
+        </w:tabs>
+        <w:ind w:left="5040" w:hanging="360"/>
+      </w:pPr>
+      <w:rPr>
+        <w:rFonts w:ascii="Wingdings" w:hAnsi="Wingdings" w:hint="default"/>
+        <w:sz w:val="20"/>
+      </w:rPr>
+    </w:lvl>
+    <w:lvl w:ilvl="7" w:tentative="1">
+      <w:start w:val="1"/>
+      <w:numFmt w:val="bullet"/>
+      <w:lvlText w:val=""/>
+      <w:lvlJc w:val="left"/>
+      <w:pPr>
+        <w:tabs>
+          <w:tab w:val="num" w:pos="5760"/>
+        </w:tabs>
+        <w:ind w:left="5760" w:hanging="360"/>
+      </w:pPr>
+      <w:rPr>
+        <w:rFonts w:ascii="Wingdings" w:hAnsi="Wingdings" w:hint="default"/>
+        <w:sz w:val="20"/>
+      </w:rPr>
+    </w:lvl>
+    <w:lvl w:ilvl="8" w:tentative="1">
+      <w:start w:val="1"/>
+      <w:numFmt w:val="bullet"/>
+      <w:lvlText w:val=""/>
+      <w:lvlJc w:val="left"/>
+      <w:pPr>
+        <w:tabs>
+          <w:tab w:val="num" w:pos="6480"/>
+        </w:tabs>
+        <w:ind w:left="6480" w:hanging="360"/>
+      </w:pPr>
+      <w:rPr>
+        <w:rFonts w:ascii="Wingdings" w:hAnsi="Wingdings" w:hint="default"/>
+        <w:sz w:val="20"/>
+      </w:rPr>
+    </w:lvl>
+  </w:abstractNum>
+  <w:abstractNum w:abstractNumId="1">
+    <w:nsid w:val="0D2E57CD"/>
+    <w:multiLevelType w:val="multilevel"/>
+    <w:tmpl w:val="50A2D05E"/>
+    <w:lvl w:ilvl="0">
+      <w:start w:val="1"/>
+      <w:numFmt w:val="bullet"/>
+      <w:lvlText w:val=""/>
+      <w:lvlJc w:val="left"/>
+      <w:pPr>
+        <w:tabs>
+          <w:tab w:val="num" w:pos="720"/>
+        </w:tabs>
+        <w:ind w:left="720" w:hanging="360"/>
+      </w:pPr>
+      <w:rPr>
+        <w:rFonts w:ascii="Symbol" w:hAnsi="Symbol" w:hint="default"/>
+        <w:sz w:val="20"/>
+      </w:rPr>
+    </w:lvl>
+    <w:lvl w:ilvl="1" w:tentative="1">
+      <w:start w:val="1"/>
+      <w:numFmt w:val="bullet"/>
+      <w:lvlText w:val="o"/>
+      <w:lvlJc w:val="left"/>
+      <w:pPr>
+        <w:tabs>
+          <w:tab w:val="num" w:pos="1440"/>
+        </w:tabs>
+        <w:ind w:left="1440" w:hanging="360"/>
+      </w:pPr>
+      <w:rPr>
+        <w:rFonts w:ascii="Courier New" w:hAnsi="Courier New" w:hint="default"/>
+        <w:sz w:val="20"/>
+      </w:rPr>
+    </w:lvl>
+    <w:lvl w:ilvl="2" w:tentative="1">
+      <w:start w:val="1"/>
+      <w:numFmt w:val="bullet"/>
+      <w:lvlText w:val=""/>
+      <w:lvlJc w:val="left"/>
+      <w:pPr>
+        <w:tabs>
+          <w:tab w:val="num" w:pos="2160"/>
+        </w:tabs>
+        <w:ind w:left="2160" w:hanging="360"/>
+      </w:pPr>
+      <w:rPr>
+        <w:rFonts w:ascii="Wingdings" w:hAnsi="Wingdings" w:hint="default"/>
+        <w:sz w:val="20"/>
+      </w:rPr>
+    </w:lvl>
+    <w:lvl w:ilvl="3" w:tentative="1">
+      <w:start w:val="1"/>
+      <w:numFmt w:val="bullet"/>
+      <w:lvlText w:val=""/>
+      <w:lvlJc w:val="left"/>
+      <w:pPr>
+        <w:tabs>
+          <w:tab w:val="num" w:pos="2880"/>
+        </w:tabs>
+        <w:ind w:left="2880" w:hanging="360"/>
+      </w:pPr>
+      <w:rPr>
+        <w:rFonts w:ascii="Wingdings" w:hAnsi="Wingdings" w:hint="default"/>
+        <w:sz w:val="20"/>
+      </w:rPr>
+    </w:lvl>
+    <w:lvl w:ilvl="4" w:tentative="1">
+      <w:start w:val="1"/>
+      <w:numFmt w:val="bullet"/>
+      <w:lvlText w:val=""/>
+      <w:lvlJc w:val="left"/>
+      <w:pPr>
+        <w:tabs>
+          <w:tab w:val="num" w:pos="3600"/>
+        </w:tabs>
+        <w:ind w:left="3600" w:hanging="360"/>
+      </w:pPr>
+      <w:rPr>
+        <w:rFonts w:ascii="Wingdings" w:hAnsi="Wingdings" w:hint="default"/>
+        <w:sz w:val="20"/>
+      </w:rPr>
+    </w:lvl>
+    <w:lvl w:ilvl="5" w:tentative="1">
+      <w:start w:val="1"/>
+      <w:numFmt w:val="bullet"/>
+      <w:lvlText w:val=""/>
+      <w:lvlJc w:val="left"/>
+      <w:pPr>
+        <w:tabs>
+          <w:tab w:val="num" w:pos="4320"/>
+        </w:tabs>
+        <w:ind w:left="4320" w:hanging="360"/>
+      </w:pPr>
+      <w:rPr>
+        <w:rFonts w:ascii="Wingdings" w:hAnsi="Wingdings" w:hint="default"/>
+        <w:sz w:val="20"/>
+      </w:rPr>
+    </w:lvl>
+    <w:lvl w:ilvl="6" w:tentative="1">
+      <w:start w:val="1"/>
+      <w:numFmt w:val="bullet"/>
+      <w:lvlText w:val=""/>
+      <w:lvlJc w:val="left"/>
+      <w:pPr>
+        <w:tabs>
+          <w:tab w:val="num" w:pos="5040"/>
+        </w:tabs>
+        <w:ind w:left="5040" w:hanging="360"/>
+      </w:pPr>
+      <w:rPr>
+        <w:rFonts w:ascii="Wingdings" w:hAnsi="Wingdings" w:hint="default"/>
+        <w:sz w:val="20"/>
+      </w:rPr>
+    </w:lvl>
+    <w:lvl w:ilvl="7" w:tentative="1">
+      <w:start w:val="1"/>
+      <w:numFmt w:val="bullet"/>
+      <w:lvlText w:val=""/>
+      <w:lvlJc w:val="left"/>
+      <w:pPr>
+        <w:tabs>
+          <w:tab w:val="num" w:pos="5760"/>
+        </w:tabs>
+        <w:ind w:left="5760" w:hanging="360"/>
+      </w:pPr>
+      <w:rPr>
+        <w:rFonts w:ascii="Wingdings" w:hAnsi="Wingdings" w:hint="default"/>
+        <w:sz w:val="20"/>
+      </w:rPr>
+    </w:lvl>
+    <w:lvl w:ilvl="8" w:tentative="1">
+      <w:start w:val="1"/>
+      <w:numFmt w:val="bullet"/>
+      <w:lvlText w:val=""/>
+      <w:lvlJc w:val="left"/>
+      <w:pPr>
+        <w:tabs>
+          <w:tab w:val="num" w:pos="6480"/>
+        </w:tabs>
+        <w:ind w:left="6480" w:hanging="360"/>
+      </w:pPr>
+      <w:rPr>
+        <w:rFonts w:ascii="Wingdings" w:hAnsi="Wingdings" w:hint="default"/>
+        <w:sz w:val="20"/>
+      </w:rPr>
+    </w:lvl>
+  </w:abstractNum>
+  <w:abstractNum w:abstractNumId="2">
+    <w:nsid w:val="18774627"/>
+    <w:multiLevelType w:val="multilevel"/>
+    <w:tmpl w:val="FC1E8E06"/>
+    <w:lvl w:ilvl="0">
+      <w:start w:val="1"/>
+      <w:numFmt w:val="bullet"/>
+      <w:lvlText w:val=""/>
+      <w:lvlJc w:val="left"/>
+      <w:pPr>
+        <w:tabs>
+          <w:tab w:val="num" w:pos="720"/>
+        </w:tabs>
+        <w:ind w:left="720" w:hanging="360"/>
+      </w:pPr>
+      <w:rPr>
+        <w:rFonts w:ascii="Symbol" w:hAnsi="Symbol" w:hint="default"/>
+        <w:sz w:val="20"/>
+      </w:rPr>
+    </w:lvl>
+    <w:lvl w:ilvl="1" w:tentative="1">
+      <w:start w:val="1"/>
+      <w:numFmt w:val="bullet"/>
+      <w:lvlText w:val="o"/>
+      <w:lvlJc w:val="left"/>
+      <w:pPr>
+        <w:tabs>
+          <w:tab w:val="num" w:pos="1440"/>
+        </w:tabs>
+        <w:ind w:left="1440" w:hanging="360"/>
+      </w:pPr>
+      <w:rPr>
+        <w:rFonts w:ascii="Courier New" w:hAnsi="Courier New" w:hint="default"/>
+        <w:sz w:val="20"/>
+      </w:rPr>
+    </w:lvl>
+    <w:lvl w:ilvl="2" w:tentative="1">
+      <w:start w:val="1"/>
+      <w:numFmt w:val="bullet"/>
+      <w:lvlText w:val=""/>
+      <w:lvlJc w:val="left"/>
+      <w:pPr>
+        <w:tabs>
+          <w:tab w:val="num" w:pos="2160"/>
+        </w:tabs>
+        <w:ind w:left="2160" w:hanging="360"/>
+      </w:pPr>
+      <w:rPr>
+        <w:rFonts w:ascii="Wingdings" w:hAnsi="Wingdings" w:hint="default"/>
+        <w:sz w:val="20"/>
+      </w:rPr>
+    </w:lvl>
+    <w:lvl w:ilvl="3" w:tentative="1">
+      <w:start w:val="1"/>
+      <w:numFmt w:val="bullet"/>
+      <w:lvlText w:val=""/>
+      <w:lvlJc w:val="left"/>
+      <w:pPr>
+        <w:tabs>
+          <w:tab w:val="num" w:pos="2880"/>
+        </w:tabs>
+        <w:ind w:left="2880" w:hanging="360"/>
+      </w:pPr>
+      <w:rPr>
+        <w:rFonts w:ascii="Wingdings" w:hAnsi="Wingdings" w:hint="default"/>
+        <w:sz w:val="20"/>
+      </w:rPr>
+    </w:lvl>
+    <w:lvl w:ilvl="4" w:tentative="1">
+      <w:start w:val="1"/>
+      <w:numFmt w:val="bullet"/>
+      <w:lvlText w:val=""/>
+      <w:lvlJc w:val="left"/>
+      <w:pPr>
+        <w:tabs>
+          <w:tab w:val="num" w:pos="3600"/>
+        </w:tabs>
+        <w:ind w:left="3600" w:hanging="360"/>
+      </w:pPr>
+      <w:rPr>
+        <w:rFonts w:ascii="Wingdings" w:hAnsi="Wingdings" w:hint="default"/>
+        <w:sz w:val="20"/>
+      </w:rPr>
+    </w:lvl>
+    <w:lvl w:ilvl="5" w:tentative="1">
+      <w:start w:val="1"/>
+      <w:numFmt w:val="bullet"/>
+      <w:lvlText w:val=""/>
+      <w:lvlJc w:val="left"/>
+      <w:pPr>
+        <w:tabs>
+          <w:tab w:val="num" w:pos="4320"/>
+        </w:tabs>
+        <w:ind w:left="4320" w:hanging="360"/>
+      </w:pPr>
+      <w:rPr>
+        <w:rFonts w:ascii="Wingdings" w:hAnsi="Wingdings" w:hint="default"/>
+        <w:sz w:val="20"/>
+      </w:rPr>
+    </w:lvl>
+    <w:lvl w:ilvl="6" w:tentative="1">
+      <w:start w:val="1"/>
+      <w:numFmt w:val="bullet"/>
+      <w:lvlText w:val=""/>
+      <w:lvlJc w:val="left"/>
+      <w:pPr>
+        <w:tabs>
+          <w:tab w:val="num" w:pos="5040"/>
+        </w:tabs>
+        <w:ind w:left="5040" w:hanging="360"/>
+      </w:pPr>
+      <w:rPr>
+        <w:rFonts w:ascii="Wingdings" w:hAnsi="Wingdings" w:hint="default"/>
+        <w:sz w:val="20"/>
+      </w:rPr>
+    </w:lvl>
+    <w:lvl w:ilvl="7" w:tentative="1">
+      <w:start w:val="1"/>
+      <w:numFmt w:val="bullet"/>
+      <w:lvlText w:val=""/>
+      <w:lvlJc w:val="left"/>
+      <w:pPr>
+        <w:tabs>
+          <w:tab w:val="num" w:pos="5760"/>
+        </w:tabs>
+        <w:ind w:left="5760" w:hanging="360"/>
+      </w:pPr>
+      <w:rPr>
+        <w:rFonts w:ascii="Wingdings" w:hAnsi="Wingdings" w:hint="default"/>
+        <w:sz w:val="20"/>
+      </w:rPr>
+    </w:lvl>
+    <w:lvl w:ilvl="8" w:tentative="1">
+      <w:start w:val="1"/>
+      <w:numFmt w:val="bullet"/>
+      <w:lvlText w:val=""/>
+      <w:lvlJc w:val="left"/>
+      <w:pPr>
+        <w:tabs>
+          <w:tab w:val="num" w:pos="6480"/>
+        </w:tabs>
+        <w:ind w:left="6480" w:hanging="360"/>
+      </w:pPr>
+      <w:rPr>
+        <w:rFonts w:ascii="Wingdings" w:hAnsi="Wingdings" w:hint="default"/>
+        <w:sz w:val="20"/>
+      </w:rPr>
+    </w:lvl>
+  </w:abstractNum>
+  <w:abstractNum w:abstractNumId="3">
+    <w:nsid w:val="31141B8E"/>
+    <w:multiLevelType w:val="multilevel"/>
+    <w:tmpl w:val="BF8CDB0C"/>
+    <w:lvl w:ilvl="0">
+      <w:start w:val="1"/>
+      <w:numFmt w:val="bullet"/>
+      <w:lvlText w:val=""/>
+      <w:lvlJc w:val="left"/>
+      <w:pPr>
+        <w:tabs>
+          <w:tab w:val="num" w:pos="720"/>
+        </w:tabs>
+        <w:ind w:left="720" w:hanging="360"/>
+      </w:pPr>
+      <w:rPr>
+        <w:rFonts w:ascii="Symbol" w:hAnsi="Symbol" w:hint="default"/>
+        <w:sz w:val="20"/>
+      </w:rPr>
+    </w:lvl>
+    <w:lvl w:ilvl="1" w:tentative="1">
+      <w:start w:val="1"/>
+      <w:numFmt w:val="bullet"/>
+      <w:lvlText w:val="o"/>
+      <w:lvlJc w:val="left"/>
+      <w:pPr>
+        <w:tabs>
+          <w:tab w:val="num" w:pos="1440"/>
+        </w:tabs>
+        <w:ind w:left="1440" w:hanging="360"/>
+      </w:pPr>
+      <w:rPr>
+        <w:rFonts w:ascii="Courier New" w:hAnsi="Courier New" w:hint="default"/>
+        <w:sz w:val="20"/>
+      </w:rPr>
+    </w:lvl>
+    <w:lvl w:ilvl="2" w:tentative="1">
+      <w:start w:val="1"/>
+      <w:numFmt w:val="bullet"/>
+      <w:lvlText w:val=""/>
+      <w:lvlJc w:val="left"/>
+      <w:pPr>
+        <w:tabs>
+          <w:tab w:val="num" w:pos="2160"/>
+        </w:tabs>
+        <w:ind w:left="2160" w:hanging="360"/>
+      </w:pPr>
+      <w:rPr>
+        <w:rFonts w:ascii="Wingdings" w:hAnsi="Wingdings" w:hint="default"/>
+        <w:sz w:val="20"/>
+      </w:rPr>
+    </w:lvl>
+    <w:lvl w:ilvl="3" w:tentative="1">
+      <w:start w:val="1"/>
+      <w:numFmt w:val="bullet"/>
+      <w:lvlText w:val=""/>
+      <w:lvlJc w:val="left"/>
+      <w:pPr>
+        <w:tabs>
+          <w:tab w:val="num" w:pos="2880"/>
+        </w:tabs>
+        <w:ind w:left="2880" w:hanging="360"/>
+      </w:pPr>
+      <w:rPr>
+        <w:rFonts w:ascii="Wingdings" w:hAnsi="Wingdings" w:hint="default"/>
+        <w:sz w:val="20"/>
+      </w:rPr>
+    </w:lvl>
+    <w:lvl w:ilvl="4" w:tentative="1">
+      <w:start w:val="1"/>
+      <w:numFmt w:val="bullet"/>
+      <w:lvlText w:val=""/>
+      <w:lvlJc w:val="left"/>
+      <w:pPr>
+        <w:tabs>
+          <w:tab w:val="num" w:pos="3600"/>
+        </w:tabs>
+        <w:ind w:left="3600" w:hanging="360"/>
+      </w:pPr>
+      <w:rPr>
+        <w:rFonts w:ascii="Wingdings" w:hAnsi="Wingdings" w:hint="default"/>
+        <w:sz w:val="20"/>
+      </w:rPr>
+    </w:lvl>
+    <w:lvl w:ilvl="5" w:tentative="1">
+      <w:start w:val="1"/>
+      <w:numFmt w:val="bullet"/>
+      <w:lvlText w:val=""/>
+      <w:lvlJc w:val="left"/>
+      <w:pPr>
+        <w:tabs>
+          <w:tab w:val="num" w:pos="4320"/>
+        </w:tabs>
+        <w:ind w:left="4320" w:hanging="360"/>
+      </w:pPr>
+      <w:rPr>
+        <w:rFonts w:ascii="Wingdings" w:hAnsi="Wingdings" w:hint="default"/>
+        <w:sz w:val="20"/>
+      </w:rPr>
+    </w:lvl>
+    <w:lvl w:ilvl="6" w:tentative="1">
+      <w:start w:val="1"/>
+      <w:numFmt w:val="bullet"/>
+      <w:lvlText w:val=""/>
+      <w:lvlJc w:val="left"/>
+      <w:pPr>
+        <w:tabs>
+          <w:tab w:val="num" w:pos="5040"/>
+        </w:tabs>
+        <w:ind w:left="5040" w:hanging="360"/>
+      </w:pPr>
+      <w:rPr>
+        <w:rFonts w:ascii="Wingdings" w:hAnsi="Wingdings" w:hint="default"/>
+        <w:sz w:val="20"/>
+      </w:rPr>
+    </w:lvl>
+    <w:lvl w:ilvl="7" w:tentative="1">
+      <w:start w:val="1"/>
+      <w:numFmt w:val="bullet"/>
+      <w:lvlText w:val=""/>
+      <w:lvlJc w:val="left"/>
+      <w:pPr>
+        <w:tabs>
+          <w:tab w:val="num" w:pos="5760"/>
+        </w:tabs>
+        <w:ind w:left="5760" w:hanging="360"/>
+      </w:pPr>
+      <w:rPr>
+        <w:rFonts w:ascii="Wingdings" w:hAnsi="Wingdings" w:hint="default"/>
+        <w:sz w:val="20"/>
+      </w:rPr>
+    </w:lvl>
+    <w:lvl w:ilvl="8" w:tentative="1">
+      <w:start w:val="1"/>
+      <w:numFmt w:val="bullet"/>
+      <w:lvlText w:val=""/>
+      <w:lvlJc w:val="left"/>
+      <w:pPr>
+        <w:tabs>
+          <w:tab w:val="num" w:pos="6480"/>
+        </w:tabs>
+        <w:ind w:left="6480" w:hanging="360"/>
+      </w:pPr>
+      <w:rPr>
+        <w:rFonts w:ascii="Wingdings" w:hAnsi="Wingdings" w:hint="default"/>
+        <w:sz w:val="20"/>
+      </w:rPr>
+    </w:lvl>
+  </w:abstractNum>
+  <w:abstractNum w:abstractNumId="4">
+    <w:nsid w:val="3D1A487B"/>
+    <w:multiLevelType w:val="multilevel"/>
+    <w:tmpl w:val="B8A8860E"/>
+    <w:lvl w:ilvl="0">
+      <w:start w:val="1"/>
+      <w:numFmt w:val="bullet"/>
+      <w:lvlText w:val=""/>
+      <w:lvlJc w:val="left"/>
+      <w:pPr>
+        <w:tabs>
+          <w:tab w:val="num" w:pos="720"/>
+        </w:tabs>
+        <w:ind w:left="720" w:hanging="360"/>
+      </w:pPr>
+      <w:rPr>
+        <w:rFonts w:ascii="Symbol" w:hAnsi="Symbol" w:hint="default"/>
+        <w:sz w:val="20"/>
+      </w:rPr>
+    </w:lvl>
+    <w:lvl w:ilvl="1" w:tentative="1">
+      <w:start w:val="1"/>
+      <w:numFmt w:val="bullet"/>
+      <w:lvlText w:val="o"/>
+      <w:lvlJc w:val="left"/>
+      <w:pPr>
+        <w:tabs>
+          <w:tab w:val="num" w:pos="1440"/>
+        </w:tabs>
+        <w:ind w:left="1440" w:hanging="360"/>
+      </w:pPr>
+      <w:rPr>
+        <w:rFonts w:ascii="Courier New" w:hAnsi="Courier New" w:hint="default"/>
+        <w:sz w:val="20"/>
+      </w:rPr>
+    </w:lvl>
+    <w:lvl w:ilvl="2" w:tentative="1">
+      <w:start w:val="1"/>
+      <w:numFmt w:val="bullet"/>
+      <w:lvlText w:val=""/>
+      <w:lvlJc w:val="left"/>
+      <w:pPr>
+        <w:tabs>
+          <w:tab w:val="num" w:pos="2160"/>
+        </w:tabs>
+        <w:ind w:left="2160" w:hanging="360"/>
+      </w:pPr>
+      <w:rPr>
+        <w:rFonts w:ascii="Wingdings" w:hAnsi="Wingdings" w:hint="default"/>
+        <w:sz w:val="20"/>
+      </w:rPr>
+    </w:lvl>
+    <w:lvl w:ilvl="3" w:tentative="1">
+      <w:start w:val="1"/>
+      <w:numFmt w:val="bullet"/>
+      <w:lvlText w:val=""/>
+      <w:lvlJc w:val="left"/>
+      <w:pPr>
+        <w:tabs>
+          <w:tab w:val="num" w:pos="2880"/>
+        </w:tabs>
+        <w:ind w:left="2880" w:hanging="360"/>
+      </w:pPr>
+      <w:rPr>
+        <w:rFonts w:ascii="Wingdings" w:hAnsi="Wingdings" w:hint="default"/>
+        <w:sz w:val="20"/>
+      </w:rPr>
+    </w:lvl>
+    <w:lvl w:ilvl="4" w:tentative="1">
+      <w:start w:val="1"/>
+      <w:numFmt w:val="bullet"/>
+      <w:lvlText w:val=""/>
+      <w:lvlJc w:val="left"/>
+      <w:pPr>
+        <w:tabs>
+          <w:tab w:val="num" w:pos="3600"/>
+        </w:tabs>
+        <w:ind w:left="3600" w:hanging="360"/>
+      </w:pPr>
+      <w:rPr>
+        <w:rFonts w:ascii="Wingdings" w:hAnsi="Wingdings" w:hint="default"/>
+        <w:sz w:val="20"/>
+      </w:rPr>
+    </w:lvl>
+    <w:lvl w:ilvl="5" w:tentative="1">
+      <w:start w:val="1"/>
+      <w:numFmt w:val="bullet"/>
+      <w:lvlText w:val=""/>
+      <w:lvlJc w:val="left"/>
+      <w:pPr>
+        <w:tabs>
+          <w:tab w:val="num" w:pos="4320"/>
+        </w:tabs>
+        <w:ind w:left="4320" w:hanging="360"/>
+      </w:pPr>
+      <w:rPr>
+        <w:rFonts w:ascii="Wingdings" w:hAnsi="Wingdings" w:hint="default"/>
+        <w:sz w:val="20"/>
+      </w:rPr>
+    </w:lvl>
+    <w:lvl w:ilvl="6" w:tentative="1">
+      <w:start w:val="1"/>
+      <w:numFmt w:val="bullet"/>
+      <w:lvlText w:val=""/>
+      <w:lvlJc w:val="left"/>
+      <w:pPr>
+        <w:tabs>
+          <w:tab w:val="num" w:pos="5040"/>
+        </w:tabs>
+        <w:ind w:left="5040" w:hanging="360"/>
+      </w:pPr>
+      <w:rPr>
+        <w:rFonts w:ascii="Wingdings" w:hAnsi="Wingdings" w:hint="default"/>
+        <w:sz w:val="20"/>
+      </w:rPr>
+    </w:lvl>
+    <w:lvl w:ilvl="7" w:tentative="1">
+      <w:start w:val="1"/>
+      <w:numFmt w:val="bullet"/>
+      <w:lvlText w:val=""/>
+      <w:lvlJc w:val="left"/>
+      <w:pPr>
+        <w:tabs>
+          <w:tab w:val="num" w:pos="5760"/>
+        </w:tabs>
+        <w:ind w:left="5760" w:hanging="360"/>
+      </w:pPr>
+      <w:rPr>
+        <w:rFonts w:ascii="Wingdings" w:hAnsi="Wingdings" w:hint="default"/>
+        <w:sz w:val="20"/>
+      </w:rPr>
+    </w:lvl>
+    <w:lvl w:ilvl="8" w:tentative="1">
+      <w:start w:val="1"/>
+      <w:numFmt w:val="bullet"/>
+      <w:lvlText w:val=""/>
+      <w:lvlJc w:val="left"/>
+      <w:pPr>
+        <w:tabs>
+          <w:tab w:val="num" w:pos="6480"/>
+        </w:tabs>
+        <w:ind w:left="6480" w:hanging="360"/>
+      </w:pPr>
+      <w:rPr>
+        <w:rFonts w:ascii="Wingdings" w:hAnsi="Wingdings" w:hint="default"/>
+        <w:sz w:val="20"/>
+      </w:rPr>
+    </w:lvl>
+  </w:abstractNum>
+  <w:abstractNum w:abstractNumId="5">
     <w:nsid w:val="43B94A8C"/>
     <w:multiLevelType w:val="hybridMultilevel"/>
     <w:tmpl w:val="2D0EC5F0"/>
@@ -1211,7 +3400,305 @@
       <w:lvlJc w:val="left"/>
     </w:lvl>
   </w:abstractNum>
-  <w:abstractNum w:abstractNumId="1">
+  <w:abstractNum w:abstractNumId="6">
+    <w:nsid w:val="485C357F"/>
+    <w:multiLevelType w:val="multilevel"/>
+    <w:tmpl w:val="F4EA5AF6"/>
+    <w:lvl w:ilvl="0">
+      <w:start w:val="1"/>
+      <w:numFmt w:val="bullet"/>
+      <w:lvlText w:val=""/>
+      <w:lvlJc w:val="left"/>
+      <w:pPr>
+        <w:tabs>
+          <w:tab w:val="num" w:pos="720"/>
+        </w:tabs>
+        <w:ind w:left="720" w:hanging="360"/>
+      </w:pPr>
+      <w:rPr>
+        <w:rFonts w:ascii="Symbol" w:hAnsi="Symbol" w:hint="default"/>
+        <w:sz w:val="20"/>
+      </w:rPr>
+    </w:lvl>
+    <w:lvl w:ilvl="1" w:tentative="1">
+      <w:start w:val="1"/>
+      <w:numFmt w:val="bullet"/>
+      <w:lvlText w:val="o"/>
+      <w:lvlJc w:val="left"/>
+      <w:pPr>
+        <w:tabs>
+          <w:tab w:val="num" w:pos="1440"/>
+        </w:tabs>
+        <w:ind w:left="1440" w:hanging="360"/>
+      </w:pPr>
+      <w:rPr>
+        <w:rFonts w:ascii="Courier New" w:hAnsi="Courier New" w:hint="default"/>
+        <w:sz w:val="20"/>
+      </w:rPr>
+    </w:lvl>
+    <w:lvl w:ilvl="2" w:tentative="1">
+      <w:start w:val="1"/>
+      <w:numFmt w:val="bullet"/>
+      <w:lvlText w:val=""/>
+      <w:lvlJc w:val="left"/>
+      <w:pPr>
+        <w:tabs>
+          <w:tab w:val="num" w:pos="2160"/>
+        </w:tabs>
+        <w:ind w:left="2160" w:hanging="360"/>
+      </w:pPr>
+      <w:rPr>
+        <w:rFonts w:ascii="Wingdings" w:hAnsi="Wingdings" w:hint="default"/>
+        <w:sz w:val="20"/>
+      </w:rPr>
+    </w:lvl>
+    <w:lvl w:ilvl="3" w:tentative="1">
+      <w:start w:val="1"/>
+      <w:numFmt w:val="bullet"/>
+      <w:lvlText w:val=""/>
+      <w:lvlJc w:val="left"/>
+      <w:pPr>
+        <w:tabs>
+          <w:tab w:val="num" w:pos="2880"/>
+        </w:tabs>
+        <w:ind w:left="2880" w:hanging="360"/>
+      </w:pPr>
+      <w:rPr>
+        <w:rFonts w:ascii="Wingdings" w:hAnsi="Wingdings" w:hint="default"/>
+        <w:sz w:val="20"/>
+      </w:rPr>
+    </w:lvl>
+    <w:lvl w:ilvl="4" w:tentative="1">
+      <w:start w:val="1"/>
+      <w:numFmt w:val="bullet"/>
+      <w:lvlText w:val=""/>
+      <w:lvlJc w:val="left"/>
+      <w:pPr>
+        <w:tabs>
+          <w:tab w:val="num" w:pos="3600"/>
+        </w:tabs>
+        <w:ind w:left="3600" w:hanging="360"/>
+      </w:pPr>
+      <w:rPr>
+        <w:rFonts w:ascii="Wingdings" w:hAnsi="Wingdings" w:hint="default"/>
+        <w:sz w:val="20"/>
+      </w:rPr>
+    </w:lvl>
+    <w:lvl w:ilvl="5" w:tentative="1">
+      <w:start w:val="1"/>
+      <w:numFmt w:val="bullet"/>
+      <w:lvlText w:val=""/>
+      <w:lvlJc w:val="left"/>
+      <w:pPr>
+        <w:tabs>
+          <w:tab w:val="num" w:pos="4320"/>
+        </w:tabs>
+        <w:ind w:left="4320" w:hanging="360"/>
+      </w:pPr>
+      <w:rPr>
+        <w:rFonts w:ascii="Wingdings" w:hAnsi="Wingdings" w:hint="default"/>
+        <w:sz w:val="20"/>
+      </w:rPr>
+    </w:lvl>
+    <w:lvl w:ilvl="6" w:tentative="1">
+      <w:start w:val="1"/>
+      <w:numFmt w:val="bullet"/>
+      <w:lvlText w:val=""/>
+      <w:lvlJc w:val="left"/>
+      <w:pPr>
+        <w:tabs>
+          <w:tab w:val="num" w:pos="5040"/>
+        </w:tabs>
+        <w:ind w:left="5040" w:hanging="360"/>
+      </w:pPr>
+      <w:rPr>
+        <w:rFonts w:ascii="Wingdings" w:hAnsi="Wingdings" w:hint="default"/>
+        <w:sz w:val="20"/>
+      </w:rPr>
+    </w:lvl>
+    <w:lvl w:ilvl="7" w:tentative="1">
+      <w:start w:val="1"/>
+      <w:numFmt w:val="bullet"/>
+      <w:lvlText w:val=""/>
+      <w:lvlJc w:val="left"/>
+      <w:pPr>
+        <w:tabs>
+          <w:tab w:val="num" w:pos="5760"/>
+        </w:tabs>
+        <w:ind w:left="5760" w:hanging="360"/>
+      </w:pPr>
+      <w:rPr>
+        <w:rFonts w:ascii="Wingdings" w:hAnsi="Wingdings" w:hint="default"/>
+        <w:sz w:val="20"/>
+      </w:rPr>
+    </w:lvl>
+    <w:lvl w:ilvl="8" w:tentative="1">
+      <w:start w:val="1"/>
+      <w:numFmt w:val="bullet"/>
+      <w:lvlText w:val=""/>
+      <w:lvlJc w:val="left"/>
+      <w:pPr>
+        <w:tabs>
+          <w:tab w:val="num" w:pos="6480"/>
+        </w:tabs>
+        <w:ind w:left="6480" w:hanging="360"/>
+      </w:pPr>
+      <w:rPr>
+        <w:rFonts w:ascii="Wingdings" w:hAnsi="Wingdings" w:hint="default"/>
+        <w:sz w:val="20"/>
+      </w:rPr>
+    </w:lvl>
+  </w:abstractNum>
+  <w:abstractNum w:abstractNumId="7">
+    <w:nsid w:val="491E58CC"/>
+    <w:multiLevelType w:val="multilevel"/>
+    <w:tmpl w:val="BF1C45B4"/>
+    <w:lvl w:ilvl="0">
+      <w:start w:val="1"/>
+      <w:numFmt w:val="bullet"/>
+      <w:lvlText w:val=""/>
+      <w:lvlJc w:val="left"/>
+      <w:pPr>
+        <w:tabs>
+          <w:tab w:val="num" w:pos="720"/>
+        </w:tabs>
+        <w:ind w:left="720" w:hanging="360"/>
+      </w:pPr>
+      <w:rPr>
+        <w:rFonts w:ascii="Symbol" w:hAnsi="Symbol" w:hint="default"/>
+        <w:sz w:val="20"/>
+      </w:rPr>
+    </w:lvl>
+    <w:lvl w:ilvl="1" w:tentative="1">
+      <w:start w:val="1"/>
+      <w:numFmt w:val="bullet"/>
+      <w:lvlText w:val="o"/>
+      <w:lvlJc w:val="left"/>
+      <w:pPr>
+        <w:tabs>
+          <w:tab w:val="num" w:pos="1440"/>
+        </w:tabs>
+        <w:ind w:left="1440" w:hanging="360"/>
+      </w:pPr>
+      <w:rPr>
+        <w:rFonts w:ascii="Courier New" w:hAnsi="Courier New" w:hint="default"/>
+        <w:sz w:val="20"/>
+      </w:rPr>
+    </w:lvl>
+    <w:lvl w:ilvl="2" w:tentative="1">
+      <w:start w:val="1"/>
+      <w:numFmt w:val="bullet"/>
+      <w:lvlText w:val=""/>
+      <w:lvlJc w:val="left"/>
+      <w:pPr>
+        <w:tabs>
+          <w:tab w:val="num" w:pos="2160"/>
+        </w:tabs>
+        <w:ind w:left="2160" w:hanging="360"/>
+      </w:pPr>
+      <w:rPr>
+        <w:rFonts w:ascii="Wingdings" w:hAnsi="Wingdings" w:hint="default"/>
+        <w:sz w:val="20"/>
+      </w:rPr>
+    </w:lvl>
+    <w:lvl w:ilvl="3" w:tentative="1">
+      <w:start w:val="1"/>
+      <w:numFmt w:val="bullet"/>
+      <w:lvlText w:val=""/>
+      <w:lvlJc w:val="left"/>
+      <w:pPr>
+        <w:tabs>
+          <w:tab w:val="num" w:pos="2880"/>
+        </w:tabs>
+        <w:ind w:left="2880" w:hanging="360"/>
+      </w:pPr>
+      <w:rPr>
+        <w:rFonts w:ascii="Wingdings" w:hAnsi="Wingdings" w:hint="default"/>
+        <w:sz w:val="20"/>
+      </w:rPr>
+    </w:lvl>
+    <w:lvl w:ilvl="4" w:tentative="1">
+      <w:start w:val="1"/>
+      <w:numFmt w:val="bullet"/>
+      <w:lvlText w:val=""/>
+      <w:lvlJc w:val="left"/>
+      <w:pPr>
+        <w:tabs>
+          <w:tab w:val="num" w:pos="3600"/>
+        </w:tabs>
+        <w:ind w:left="3600" w:hanging="360"/>
+      </w:pPr>
+      <w:rPr>
+        <w:rFonts w:ascii="Wingdings" w:hAnsi="Wingdings" w:hint="default"/>
+        <w:sz w:val="20"/>
+      </w:rPr>
+    </w:lvl>
+    <w:lvl w:ilvl="5" w:tentative="1">
+      <w:start w:val="1"/>
+      <w:numFmt w:val="bullet"/>
+      <w:lvlText w:val=""/>
+      <w:lvlJc w:val="left"/>
+      <w:pPr>
+        <w:tabs>
+          <w:tab w:val="num" w:pos="4320"/>
+        </w:tabs>
+        <w:ind w:left="4320" w:hanging="360"/>
+      </w:pPr>
+      <w:rPr>
+        <w:rFonts w:ascii="Wingdings" w:hAnsi="Wingdings" w:hint="default"/>
+        <w:sz w:val="20"/>
+      </w:rPr>
+    </w:lvl>
+    <w:lvl w:ilvl="6" w:tentative="1">
+      <w:start w:val="1"/>
+      <w:numFmt w:val="bullet"/>
+      <w:lvlText w:val=""/>
+      <w:lvlJc w:val="left"/>
+      <w:pPr>
+        <w:tabs>
+          <w:tab w:val="num" w:pos="5040"/>
+        </w:tabs>
+        <w:ind w:left="5040" w:hanging="360"/>
+      </w:pPr>
+      <w:rPr>
+        <w:rFonts w:ascii="Wingdings" w:hAnsi="Wingdings" w:hint="default"/>
+        <w:sz w:val="20"/>
+      </w:rPr>
+    </w:lvl>
+    <w:lvl w:ilvl="7" w:tentative="1">
+      <w:start w:val="1"/>
+      <w:numFmt w:val="bullet"/>
+      <w:lvlText w:val=""/>
+      <w:lvlJc w:val="left"/>
+      <w:pPr>
+        <w:tabs>
+          <w:tab w:val="num" w:pos="5760"/>
+        </w:tabs>
+        <w:ind w:left="5760" w:hanging="360"/>
+      </w:pPr>
+      <w:rPr>
+        <w:rFonts w:ascii="Wingdings" w:hAnsi="Wingdings" w:hint="default"/>
+        <w:sz w:val="20"/>
+      </w:rPr>
+    </w:lvl>
+    <w:lvl w:ilvl="8" w:tentative="1">
+      <w:start w:val="1"/>
+      <w:numFmt w:val="bullet"/>
+      <w:lvlText w:val=""/>
+      <w:lvlJc w:val="left"/>
+      <w:pPr>
+        <w:tabs>
+          <w:tab w:val="num" w:pos="6480"/>
+        </w:tabs>
+        <w:ind w:left="6480" w:hanging="360"/>
+      </w:pPr>
+      <w:rPr>
+        <w:rFonts w:ascii="Wingdings" w:hAnsi="Wingdings" w:hint="default"/>
+        <w:sz w:val="20"/>
+      </w:rPr>
+    </w:lvl>
+  </w:abstractNum>
+  <w:abstractNum w:abstractNumId="8">
     <w:nsid w:val="5FE773BB"/>
     <w:multiLevelType w:val="hybridMultilevel"/>
     <w:tmpl w:val="3A5C38C0"/>
@@ -1297,11 +3784,184 @@
       </w:pPr>
     </w:lvl>
   </w:abstractNum>
+  <w:abstractNum w:abstractNumId="9">
+    <w:nsid w:val="7096038D"/>
+    <w:multiLevelType w:val="multilevel"/>
+    <w:tmpl w:val="D46E3CD2"/>
+    <w:lvl w:ilvl="0">
+      <w:start w:val="1"/>
+      <w:numFmt w:val="bullet"/>
+      <w:lvlText w:val=""/>
+      <w:lvlJc w:val="left"/>
+      <w:pPr>
+        <w:tabs>
+          <w:tab w:val="num" w:pos="720"/>
+        </w:tabs>
+        <w:ind w:left="720" w:hanging="360"/>
+      </w:pPr>
+      <w:rPr>
+        <w:rFonts w:ascii="Symbol" w:hAnsi="Symbol" w:hint="default"/>
+        <w:sz w:val="20"/>
+      </w:rPr>
+    </w:lvl>
+    <w:lvl w:ilvl="1" w:tentative="1">
+      <w:start w:val="1"/>
+      <w:numFmt w:val="bullet"/>
+      <w:lvlText w:val="o"/>
+      <w:lvlJc w:val="left"/>
+      <w:pPr>
+        <w:tabs>
+          <w:tab w:val="num" w:pos="1440"/>
+        </w:tabs>
+        <w:ind w:left="1440" w:hanging="360"/>
+      </w:pPr>
+      <w:rPr>
+        <w:rFonts w:ascii="Courier New" w:hAnsi="Courier New" w:hint="default"/>
+        <w:sz w:val="20"/>
+      </w:rPr>
+    </w:lvl>
+    <w:lvl w:ilvl="2" w:tentative="1">
+      <w:start w:val="1"/>
+      <w:numFmt w:val="bullet"/>
+      <w:lvlText w:val=""/>
+      <w:lvlJc w:val="left"/>
+      <w:pPr>
+        <w:tabs>
+          <w:tab w:val="num" w:pos="2160"/>
+        </w:tabs>
+        <w:ind w:left="2160" w:hanging="360"/>
+      </w:pPr>
+      <w:rPr>
+        <w:rFonts w:ascii="Wingdings" w:hAnsi="Wingdings" w:hint="default"/>
+        <w:sz w:val="20"/>
+      </w:rPr>
+    </w:lvl>
+    <w:lvl w:ilvl="3" w:tentative="1">
+      <w:start w:val="1"/>
+      <w:numFmt w:val="bullet"/>
+      <w:lvlText w:val=""/>
+      <w:lvlJc w:val="left"/>
+      <w:pPr>
+        <w:tabs>
+          <w:tab w:val="num" w:pos="2880"/>
+        </w:tabs>
+        <w:ind w:left="2880" w:hanging="360"/>
+      </w:pPr>
+      <w:rPr>
+        <w:rFonts w:ascii="Wingdings" w:hAnsi="Wingdings" w:hint="default"/>
+        <w:sz w:val="20"/>
+      </w:rPr>
+    </w:lvl>
+    <w:lvl w:ilvl="4" w:tentative="1">
+      <w:start w:val="1"/>
+      <w:numFmt w:val="bullet"/>
+      <w:lvlText w:val=""/>
+      <w:lvlJc w:val="left"/>
+      <w:pPr>
+        <w:tabs>
+          <w:tab w:val="num" w:pos="3600"/>
+        </w:tabs>
+        <w:ind w:left="3600" w:hanging="360"/>
+      </w:pPr>
+      <w:rPr>
+        <w:rFonts w:ascii="Wingdings" w:hAnsi="Wingdings" w:hint="default"/>
+        <w:sz w:val="20"/>
+      </w:rPr>
+    </w:lvl>
+    <w:lvl w:ilvl="5" w:tentative="1">
+      <w:start w:val="1"/>
+      <w:numFmt w:val="bullet"/>
+      <w:lvlText w:val=""/>
+      <w:lvlJc w:val="left"/>
+      <w:pPr>
+        <w:tabs>
+          <w:tab w:val="num" w:pos="4320"/>
+        </w:tabs>
+        <w:ind w:left="4320" w:hanging="360"/>
+      </w:pPr>
+      <w:rPr>
+        <w:rFonts w:ascii="Wingdings" w:hAnsi="Wingdings" w:hint="default"/>
+        <w:sz w:val="20"/>
+      </w:rPr>
+    </w:lvl>
+    <w:lvl w:ilvl="6" w:tentative="1">
+      <w:start w:val="1"/>
+      <w:numFmt w:val="bullet"/>
+      <w:lvlText w:val=""/>
+      <w:lvlJc w:val="left"/>
+      <w:pPr>
+        <w:tabs>
+          <w:tab w:val="num" w:pos="5040"/>
+        </w:tabs>
+        <w:ind w:left="5040" w:hanging="360"/>
+      </w:pPr>
+      <w:rPr>
+        <w:rFonts w:ascii="Wingdings" w:hAnsi="Wingdings" w:hint="default"/>
+        <w:sz w:val="20"/>
+      </w:rPr>
+    </w:lvl>
+    <w:lvl w:ilvl="7" w:tentative="1">
+      <w:start w:val="1"/>
+      <w:numFmt w:val="bullet"/>
+      <w:lvlText w:val=""/>
+      <w:lvlJc w:val="left"/>
+      <w:pPr>
+        <w:tabs>
+          <w:tab w:val="num" w:pos="5760"/>
+        </w:tabs>
+        <w:ind w:left="5760" w:hanging="360"/>
+      </w:pPr>
+      <w:rPr>
+        <w:rFonts w:ascii="Wingdings" w:hAnsi="Wingdings" w:hint="default"/>
+        <w:sz w:val="20"/>
+      </w:rPr>
+    </w:lvl>
+    <w:lvl w:ilvl="8" w:tentative="1">
+      <w:start w:val="1"/>
+      <w:numFmt w:val="bullet"/>
+      <w:lvlText w:val=""/>
+      <w:lvlJc w:val="left"/>
+      <w:pPr>
+        <w:tabs>
+          <w:tab w:val="num" w:pos="6480"/>
+        </w:tabs>
+        <w:ind w:left="6480" w:hanging="360"/>
+      </w:pPr>
+      <w:rPr>
+        <w:rFonts w:ascii="Wingdings" w:hAnsi="Wingdings" w:hint="default"/>
+        <w:sz w:val="20"/>
+      </w:rPr>
+    </w:lvl>
+  </w:abstractNum>
   <w:num w:numId="1">
-    <w:abstractNumId w:val="1"/>
+    <w:abstractNumId w:val="8"/>
     <w:lvlOverride w:ilvl="0">
       <w:startOverride w:val="1"/>
     </w:lvlOverride>
+  </w:num>
+  <w:num w:numId="2">
+    <w:abstractNumId w:val="9"/>
+  </w:num>
+  <w:num w:numId="3">
+    <w:abstractNumId w:val="7"/>
+  </w:num>
+  <w:num w:numId="4">
+    <w:abstractNumId w:val="6"/>
+  </w:num>
+  <w:num w:numId="5">
+    <w:abstractNumId w:val="0"/>
+  </w:num>
+  <w:num w:numId="6">
+    <w:abstractNumId w:val="4"/>
+  </w:num>
+  <w:num w:numId="7">
+    <w:abstractNumId w:val="2"/>
+  </w:num>
+  <w:num w:numId="8">
+    <w:abstractNumId w:val="1"/>
+  </w:num>
+  <w:num w:numId="9">
+    <w:abstractNumId w:val="3"/>
   </w:num>
 </w:numbering>
 </file>
@@ -1656,6 +4316,54 @@
       <w:szCs w:val="20"/>
     </w:rPr>
   </w:style>
+  <w:style w:type="paragraph" w:customStyle="1" w:styleId="font-claude-response-body">
+    <w:name w:val="font-claude-response-body"/>
+    <w:basedOn w:val="Normal"/>
+    <w:rsid w:val="00851438"/>
+    <w:pPr>
+      <w:spacing w:before="100" w:beforeAutospacing="1" w:after="100" w:afterAutospacing="1"/>
+    </w:pPr>
+    <w:rPr>
+      <w:rFonts w:ascii="Times New Roman" w:eastAsia="Times New Roman" w:hAnsi="Times New Roman" w:cs="Times New Roman"/>
+      <w:sz w:val="24"/>
+      <w:szCs w:val="24"/>
+    </w:rPr>
+  </w:style>
+  <w:style w:type="character" w:styleId="Strong">
+    <w:name w:val="Strong"/>
+    <w:basedOn w:val="DefaultParagraphFont"/>
+    <w:uiPriority w:val="22"/>
+    <w:qFormat/>
+    <w:rsid w:val="00851438"/>
+    <w:rPr>
+      <w:b/>
+      <w:bCs/>
+    </w:rPr>
+  </w:style>
+  <w:style w:type="character" w:styleId="Emphasis">
+    <w:name w:val="Emphasis"/>
+    <w:basedOn w:val="DefaultParagraphFont"/>
+    <w:uiPriority w:val="20"/>
+    <w:qFormat/>
+    <w:rsid w:val="00851438"/>
+    <w:rPr>
+      <w:i/>
+      <w:iCs/>
+    </w:rPr>
+  </w:style>
+  <w:style w:type="character" w:styleId="HTMLCode">
+    <w:name w:val="HTML Code"/>
+    <w:basedOn w:val="DefaultParagraphFont"/>
+    <w:uiPriority w:val="99"/>
+    <w:semiHidden/>
+    <w:unhideWhenUsed/>
+    <w:rsid w:val="00BE7A8A"/>
+    <w:rPr>
+      <w:rFonts w:ascii="Courier New" w:eastAsia="Times New Roman" w:hAnsi="Courier New" w:cs="Courier New"/>
+      <w:sz w:val="20"/>
+      <w:szCs w:val="20"/>
+    </w:rPr>
+  </w:style>
 </w:styles>
 </file>
 

</xml_diff>